<commit_message>
adapted to use without yarn and with Hadoop 3.5+
</commit_message>
<xml_diff>
--- a/scripts/03/MapReduce auf Eclipse einrichten.docx
+++ b/scripts/03/MapReduce auf Eclipse einrichten.docx
@@ -13,86 +13,35 @@
         <w:rPr>
           <w:lang w:val="en-US"/>
         </w:rPr>
-        <w:t xml:space="preserve">MapReduce job </w:t>
-      </w:r>
-      <w:proofErr w:type="spellStart"/>
+        <w:t>MapReduce job mit Java i</w:t>
+      </w:r>
       <w:r>
         <w:rPr>
           <w:lang w:val="en-US"/>
         </w:rPr>
-        <w:t>mit</w:t>
-      </w:r>
-      <w:proofErr w:type="spellEnd"/>
-      <w:r>
+        <w:t>n Eclipse</w:t>
+      </w:r>
+    </w:p>
+    <w:p>
+      <w:pPr>
+        <w:pStyle w:val="berschrift2"/>
         <w:rPr>
           <w:lang w:val="en-US"/>
         </w:rPr>
-        <w:t xml:space="preserve"> Java i</w:t>
-      </w:r>
+      </w:pPr>
       <w:r>
         <w:rPr>
           <w:lang w:val="en-US"/>
         </w:rPr>
-        <w:t xml:space="preserve">n </w:t>
-      </w:r>
-      <w:r>
-        <w:rPr>
-          <w:lang w:val="en-US"/>
-        </w:rPr>
-        <w:t>Eclipse</w:t>
-      </w:r>
-    </w:p>
-    <w:p>
-      <w:pPr>
-        <w:pStyle w:val="berschrift2"/>
-        <w:rPr>
-          <w:lang w:val="en-US"/>
-        </w:rPr>
-      </w:pPr>
-      <w:proofErr w:type="spellStart"/>
-      <w:r>
-        <w:rPr>
-          <w:lang w:val="en-US"/>
-        </w:rPr>
         <w:t>Einleitung</w:t>
       </w:r>
-      <w:proofErr w:type="spellEnd"/>
-    </w:p>
-    <w:p>
-      <w:proofErr w:type="spellStart"/>
-      <w:r>
-        <w:t>Eclipse</w:t>
-      </w:r>
-      <w:proofErr w:type="spellEnd"/>
-      <w:r>
-        <w:t xml:space="preserve"> </w:t>
-      </w:r>
-      <w:r>
-        <w:t>kann (unter Nutzung der „</w:t>
-      </w:r>
-      <w:proofErr w:type="spellStart"/>
-      <w:r>
-        <w:t>Eclipse</w:t>
-      </w:r>
-      <w:proofErr w:type="spellEnd"/>
-      <w:r>
-        <w:t xml:space="preserve"> </w:t>
-      </w:r>
-      <w:proofErr w:type="spellStart"/>
-      <w:r>
-        <w:t>public</w:t>
-      </w:r>
-      <w:proofErr w:type="spellEnd"/>
-      <w:r>
-        <w:t xml:space="preserve"> </w:t>
-      </w:r>
-      <w:proofErr w:type="spellStart"/>
-      <w:r>
-        <w:t>license</w:t>
-      </w:r>
-      <w:proofErr w:type="spellEnd"/>
-      <w:r>
-        <w:t xml:space="preserve">“) frei von </w:t>
+    </w:p>
+    <w:p>
+      <w:r>
+        <w:t xml:space="preserve">Eclipse </w:t>
+      </w:r>
+      <w:r>
+        <w:t xml:space="preserve">kann (unter Nutzung der „Eclipse public license“) frei von </w:t>
       </w:r>
       <w:hyperlink r:id="rId5" w:history="1">
         <w:r>
@@ -116,91 +65,7 @@
         <w:rPr>
           <w:lang w:val="de-DE"/>
         </w:rPr>
-        <w:t xml:space="preserve">Um </w:t>
-      </w:r>
-      <w:proofErr w:type="spellStart"/>
-      <w:r>
-        <w:rPr>
-          <w:lang w:val="de-DE"/>
-        </w:rPr>
-        <w:t>gradle</w:t>
-      </w:r>
-      <w:proofErr w:type="spellEnd"/>
-      <w:r>
-        <w:rPr>
-          <w:lang w:val="de-DE"/>
-        </w:rPr>
-        <w:t xml:space="preserve"> als </w:t>
-      </w:r>
-      <w:proofErr w:type="spellStart"/>
-      <w:r>
-        <w:rPr>
-          <w:lang w:val="de-DE"/>
-        </w:rPr>
-        <w:t>Buildsystem</w:t>
-      </w:r>
-      <w:proofErr w:type="spellEnd"/>
-      <w:r>
-        <w:rPr>
-          <w:lang w:val="de-DE"/>
-        </w:rPr>
-        <w:t xml:space="preserve"> zu verwenden, ist es am einfachsten, das </w:t>
-      </w:r>
-      <w:proofErr w:type="spellStart"/>
-      <w:r>
-        <w:rPr>
-          <w:lang w:val="de-DE"/>
-        </w:rPr>
-        <w:t>plugin</w:t>
-      </w:r>
-      <w:proofErr w:type="spellEnd"/>
-      <w:r>
-        <w:rPr>
-          <w:lang w:val="de-DE"/>
-        </w:rPr>
-        <w:t xml:space="preserve"> für </w:t>
-      </w:r>
-      <w:proofErr w:type="spellStart"/>
-      <w:r>
-        <w:rPr>
-          <w:lang w:val="de-DE"/>
-        </w:rPr>
-        <w:t>IntelliJ</w:t>
-      </w:r>
-      <w:proofErr w:type="spellEnd"/>
-      <w:r>
-        <w:rPr>
-          <w:lang w:val="de-DE"/>
-        </w:rPr>
-        <w:t xml:space="preserve"> zu installieren. Für die Verwendung auf der Kommandozeile kann es nötig sein, den Installationspfad des </w:t>
-      </w:r>
-      <w:proofErr w:type="spellStart"/>
-      <w:r>
-        <w:rPr>
-          <w:lang w:val="de-DE"/>
-        </w:rPr>
-        <w:t>gradle</w:t>
-      </w:r>
-      <w:proofErr w:type="spellEnd"/>
-      <w:r>
-        <w:rPr>
-          <w:lang w:val="de-DE"/>
-        </w:rPr>
-        <w:t xml:space="preserve">-plugins in den Pfad unter „Umgebungsvariablen“ aufzunehmen oder </w:t>
-      </w:r>
-      <w:proofErr w:type="spellStart"/>
-      <w:r>
-        <w:rPr>
-          <w:lang w:val="de-DE"/>
-        </w:rPr>
-        <w:t>Gradle</w:t>
-      </w:r>
-      <w:proofErr w:type="spellEnd"/>
-      <w:r>
-        <w:rPr>
-          <w:lang w:val="de-DE"/>
-        </w:rPr>
-        <w:t xml:space="preserve"> direkt von </w:t>
+        <w:t xml:space="preserve">Um gradle als Buildsystem zu verwenden, ist es am einfachsten, das plugin für IntelliJ zu installieren. Für die Verwendung auf der Kommandozeile kann es nötig sein, den Installationspfad des gradle-plugins in den Pfad unter „Umgebungsvariablen“ aufzunehmen oder Gradle direkt von </w:t>
       </w:r>
       <w:hyperlink r:id="rId6" w:history="1">
         <w:r>
@@ -260,49 +125,7 @@
         <w:rPr>
           <w:lang w:val="de-DE"/>
         </w:rPr>
-        <w:t xml:space="preserve">Mit Hilfe eines externen </w:t>
-      </w:r>
-      <w:proofErr w:type="spellStart"/>
-      <w:r>
-        <w:rPr>
-          <w:lang w:val="de-DE"/>
-        </w:rPr>
-        <w:t>build</w:t>
-      </w:r>
-      <w:proofErr w:type="spellEnd"/>
-      <w:r>
-        <w:rPr>
-          <w:lang w:val="de-DE"/>
-        </w:rPr>
-        <w:t xml:space="preserve"> </w:t>
-      </w:r>
-      <w:proofErr w:type="spellStart"/>
-      <w:r>
-        <w:rPr>
-          <w:lang w:val="de-DE"/>
-        </w:rPr>
-        <w:t>systems</w:t>
-      </w:r>
-      <w:proofErr w:type="spellEnd"/>
-      <w:r>
-        <w:rPr>
-          <w:lang w:val="de-DE"/>
-        </w:rPr>
-        <w:t xml:space="preserve"> (vorbereitetes </w:t>
-      </w:r>
-      <w:proofErr w:type="spellStart"/>
-      <w:r>
-        <w:rPr>
-          <w:lang w:val="de-DE"/>
-        </w:rPr>
-        <w:t>build.gradle</w:t>
-      </w:r>
-      <w:proofErr w:type="spellEnd"/>
-      <w:r>
-        <w:rPr>
-          <w:lang w:val="de-DE"/>
-        </w:rPr>
-        <w:t xml:space="preserve"> File)</w:t>
+        <w:t>Mit Hilfe eines externen build systems (vorbereitetes build.gradle File)</w:t>
       </w:r>
     </w:p>
     <w:p>
@@ -320,60 +143,20 @@
         <w:rPr>
           <w:lang w:val="de-DE"/>
         </w:rPr>
-        <w:t xml:space="preserve">Mit Hilfe von </w:t>
-      </w:r>
-      <w:proofErr w:type="spellStart"/>
-      <w:r>
-        <w:rPr>
-          <w:lang w:val="de-DE"/>
-        </w:rPr>
-        <w:t>Eclipse</w:t>
-      </w:r>
-      <w:proofErr w:type="spellEnd"/>
-      <w:r>
-        <w:rPr>
-          <w:lang w:val="de-DE"/>
-        </w:rPr>
-        <w:t xml:space="preserve"> selbst als </w:t>
-      </w:r>
-      <w:proofErr w:type="spellStart"/>
-      <w:r>
-        <w:rPr>
-          <w:lang w:val="de-DE"/>
-        </w:rPr>
-        <w:t>Build</w:t>
-      </w:r>
-      <w:proofErr w:type="spellEnd"/>
-      <w:r>
-        <w:rPr>
-          <w:lang w:val="de-DE"/>
-        </w:rPr>
-        <w:t>-System (erfordert etwas mehr Vorbereitung, ist aber vielleicht besser zu verstehen)</w:t>
-      </w:r>
-    </w:p>
-    <w:p>
-      <w:pPr>
-        <w:rPr>
-          <w:lang w:val="de-DE"/>
-        </w:rPr>
-      </w:pPr>
-      <w:r>
-        <w:rPr>
-          <w:lang w:val="de-DE"/>
-        </w:rPr>
-        <w:t>Im Folgenden wird bei Abweichungen zwischen den Varianten stets die Notation @gradle bzw. @</w:t>
-      </w:r>
-      <w:r>
-        <w:rPr>
-          <w:lang w:val="de-DE"/>
-        </w:rPr>
-        <w:t>eclipse</w:t>
-      </w:r>
-      <w:r>
-        <w:rPr>
-          <w:lang w:val="de-DE"/>
-        </w:rPr>
-        <w:t xml:space="preserve"> verwendet.</w:t>
+        <w:t>Mit Hilfe von Eclipse selbst als Build-System (erfordert etwas mehr Vorbereitung, ist aber vielleicht besser zu verstehen)</w:t>
+      </w:r>
+    </w:p>
+    <w:p>
+      <w:pPr>
+        <w:rPr>
+          <w:lang w:val="de-DE"/>
+        </w:rPr>
+      </w:pPr>
+      <w:r>
+        <w:rPr>
+          <w:lang w:val="de-DE"/>
+        </w:rPr>
+        <w:t>Im Folgenden wird bei Abweichungen zwischen den Varianten stets die Notation @gradle bzw. @eclipse verwendet.</w:t>
       </w:r>
     </w:p>
     <w:p>
@@ -1126,7 +909,19 @@
     </w:p>
     <w:p>
       <w:r>
-        <w:t>Wenn eine Java-Version &gt; 11 verwendet wird, dann muss in Kompatibilität Version 11 gewählt werden</w:t>
+        <w:t xml:space="preserve">Wenn eine Java-Version &gt; 11 </w:t>
+      </w:r>
+      <w:r>
+        <w:t xml:space="preserve">(für hadoop &lt; 3.5) bzw. Version &gt; 17 (für hadoop 3.5+) </w:t>
+      </w:r>
+      <w:r>
+        <w:t>verwendet wird, dann muss in Kompatibilität Version 11</w:t>
+      </w:r>
+      <w:r>
+        <w:t>/17</w:t>
+      </w:r>
+      <w:r>
+        <w:t xml:space="preserve"> gewählt werden</w:t>
       </w:r>
       <w:r>
         <w:t>.</w:t>
@@ -1243,31 +1038,7 @@
     </w:p>
     <w:p>
       <w:r>
-        <w:t xml:space="preserve">Achtung: in neueren </w:t>
-      </w:r>
-      <w:proofErr w:type="spellStart"/>
-      <w:r>
-        <w:t>Eclipse</w:t>
-      </w:r>
-      <w:proofErr w:type="spellEnd"/>
-      <w:r>
-        <w:t>-Versionen muss man die einzelnen Libraries unter "</w:t>
-      </w:r>
-      <w:proofErr w:type="spellStart"/>
-      <w:r>
-        <w:t>Classpath</w:t>
-      </w:r>
-      <w:proofErr w:type="spellEnd"/>
-      <w:r>
-        <w:t xml:space="preserve">" </w:t>
-      </w:r>
-      <w:proofErr w:type="spellStart"/>
-      <w:r>
-        <w:t>dazuhängen</w:t>
-      </w:r>
-      <w:proofErr w:type="spellEnd"/>
-      <w:r>
-        <w:t>, davor sind die Buttons ausgegraut.</w:t>
+        <w:t>Achtung: in neueren Eclipse-Versionen muss man die einzelnen Libraries unter "Classpath" dazuhängen, davor sind die Buttons ausgegraut.</w:t>
       </w:r>
     </w:p>
     <w:p>
@@ -1679,15 +1450,7 @@
     </w:p>
     <w:p>
       <w:r>
-        <w:t xml:space="preserve">Wichtig: Im folgenden Fenster nicht "Finish", sondern "Next" klicken, damit die weiteren Detaileingaben zu Manifest und v.a. </w:t>
-      </w:r>
-      <w:proofErr w:type="spellStart"/>
-      <w:r>
-        <w:t>Einsprungspunkt</w:t>
-      </w:r>
-      <w:proofErr w:type="spellEnd"/>
-      <w:r>
-        <w:t xml:space="preserve"> gesetzt werden können.</w:t>
+        <w:t>Wichtig: Im folgenden Fenster nicht "Finish", sondern "Next" klicken, damit die weiteren Detaileingaben zu Manifest und v.a. Einsprungspunkt gesetzt werden können.</w:t>
       </w:r>
     </w:p>
     <w:p>
@@ -1897,91 +1660,7 @@
         <w:rPr>
           <w:lang w:val="de-DE"/>
         </w:rPr>
-        <w:t xml:space="preserve">Das </w:t>
-      </w:r>
-      <w:proofErr w:type="spellStart"/>
-      <w:r>
-        <w:rPr>
-          <w:lang w:val="de-DE"/>
-        </w:rPr>
-        <w:t>Hakerl</w:t>
-      </w:r>
-      <w:proofErr w:type="spellEnd"/>
-      <w:r>
-        <w:rPr>
-          <w:lang w:val="de-DE"/>
-        </w:rPr>
-        <w:t xml:space="preserve"> bei "Export </w:t>
-      </w:r>
-      <w:proofErr w:type="spellStart"/>
-      <w:r>
-        <w:rPr>
-          <w:lang w:val="de-DE"/>
-        </w:rPr>
-        <w:t>class</w:t>
-      </w:r>
-      <w:proofErr w:type="spellEnd"/>
-      <w:r>
-        <w:rPr>
-          <w:lang w:val="de-DE"/>
-        </w:rPr>
-        <w:t xml:space="preserve"> </w:t>
-      </w:r>
-      <w:proofErr w:type="spellStart"/>
-      <w:r>
-        <w:rPr>
-          <w:lang w:val="de-DE"/>
-        </w:rPr>
-        <w:t>file</w:t>
-      </w:r>
-      <w:proofErr w:type="spellEnd"/>
-      <w:r>
-        <w:rPr>
-          <w:lang w:val="de-DE"/>
-        </w:rPr>
-        <w:t xml:space="preserve"> </w:t>
-      </w:r>
-      <w:proofErr w:type="spellStart"/>
-      <w:r>
-        <w:rPr>
-          <w:lang w:val="de-DE"/>
-        </w:rPr>
-        <w:t>with</w:t>
-      </w:r>
-      <w:proofErr w:type="spellEnd"/>
-      <w:r>
-        <w:rPr>
-          <w:lang w:val="de-DE"/>
-        </w:rPr>
-        <w:t xml:space="preserve"> </w:t>
-      </w:r>
-      <w:proofErr w:type="spellStart"/>
-      <w:r>
-        <w:rPr>
-          <w:lang w:val="de-DE"/>
-        </w:rPr>
-        <w:t>compile</w:t>
-      </w:r>
-      <w:proofErr w:type="spellEnd"/>
-      <w:r>
-        <w:rPr>
-          <w:lang w:val="de-DE"/>
-        </w:rPr>
-        <w:t xml:space="preserve"> </w:t>
-      </w:r>
-      <w:proofErr w:type="spellStart"/>
-      <w:r>
-        <w:rPr>
-          <w:lang w:val="de-DE"/>
-        </w:rPr>
-        <w:t>errors</w:t>
-      </w:r>
-      <w:proofErr w:type="spellEnd"/>
-      <w:r>
-        <w:rPr>
-          <w:lang w:val="de-DE"/>
-        </w:rPr>
-        <w:t>" sollte man entfernen</w:t>
+        <w:t>Das Hakerl bei "Export class file with compile errors" sollte man entfernen</w:t>
       </w:r>
       <w:r>
         <w:rPr>
@@ -2071,39 +1750,7 @@
           <w:b/>
           <w:bCs/>
         </w:rPr>
-        <w:t>Projekt als „</w:t>
-      </w:r>
-      <w:proofErr w:type="spellStart"/>
-      <w:r>
-        <w:rPr>
-          <w:b/>
-          <w:bCs/>
-        </w:rPr>
-        <w:t>Existing</w:t>
-      </w:r>
-      <w:proofErr w:type="spellEnd"/>
-      <w:r>
-        <w:rPr>
-          <w:b/>
-          <w:bCs/>
-        </w:rPr>
-        <w:t xml:space="preserve"> </w:t>
-      </w:r>
-      <w:proofErr w:type="spellStart"/>
-      <w:r>
-        <w:rPr>
-          <w:b/>
-          <w:bCs/>
-        </w:rPr>
-        <w:t>Gradle</w:t>
-      </w:r>
-      <w:proofErr w:type="spellEnd"/>
-      <w:r>
-        <w:rPr>
-          <w:b/>
-          <w:bCs/>
-        </w:rPr>
-        <w:t xml:space="preserve"> Project“ importieren</w:t>
+        <w:t>Projekt als „Existing Gradle Project“ importieren</w:t>
       </w:r>
     </w:p>
     <w:p>
@@ -2186,23 +1833,13 @@
         </w:rPr>
         <w:t xml:space="preserve">Kategorie </w:t>
       </w:r>
-      <w:proofErr w:type="spellStart"/>
       <w:r>
         <w:rPr>
           <w:rFonts w:cstheme="minorHAnsi"/>
           <w:color w:val="ED7D31" w:themeColor="accent2"/>
           <w:lang w:val="de-DE"/>
         </w:rPr>
-        <w:t>Gradle</w:t>
-      </w:r>
-      <w:proofErr w:type="spellEnd"/>
-      <w:r>
-        <w:rPr>
-          <w:rFonts w:cstheme="minorHAnsi"/>
-          <w:color w:val="ED7D31" w:themeColor="accent2"/>
-          <w:lang w:val="de-DE"/>
-        </w:rPr>
-        <w:t xml:space="preserve"> </w:t>
+        <w:t xml:space="preserve">Gradle </w:t>
       </w:r>
       <w:r>
         <w:rPr>
@@ -2231,41 +1868,13 @@
         </w:rPr>
         <w:t xml:space="preserve">Eintrag </w:t>
       </w:r>
-      <w:proofErr w:type="spellStart"/>
       <w:r>
         <w:rPr>
           <w:rFonts w:cstheme="minorHAnsi"/>
           <w:color w:val="ED7D31" w:themeColor="accent2"/>
           <w:lang w:val="de-DE"/>
         </w:rPr>
-        <w:t>Existing</w:t>
-      </w:r>
-      <w:proofErr w:type="spellEnd"/>
-      <w:r>
-        <w:rPr>
-          <w:rFonts w:cstheme="minorHAnsi"/>
-          <w:color w:val="ED7D31" w:themeColor="accent2"/>
-          <w:lang w:val="de-DE"/>
-        </w:rPr>
-        <w:t xml:space="preserve"> </w:t>
-      </w:r>
-      <w:proofErr w:type="spellStart"/>
-      <w:r>
-        <w:rPr>
-          <w:rFonts w:cstheme="minorHAnsi"/>
-          <w:color w:val="ED7D31" w:themeColor="accent2"/>
-          <w:lang w:val="de-DE"/>
-        </w:rPr>
-        <w:t>Gradle</w:t>
-      </w:r>
-      <w:proofErr w:type="spellEnd"/>
-      <w:r>
-        <w:rPr>
-          <w:rFonts w:cstheme="minorHAnsi"/>
-          <w:color w:val="ED7D31" w:themeColor="accent2"/>
-          <w:lang w:val="de-DE"/>
-        </w:rPr>
-        <w:t xml:space="preserve"> Project </w:t>
+        <w:t xml:space="preserve">Existing Gradle Project </w:t>
       </w:r>
       <w:r>
         <w:rPr>
@@ -2327,9 +1936,18 @@
           <w:lang w:val="de-DE"/>
         </w:rPr>
         <w:lastRenderedPageBreak/>
-        <w:t xml:space="preserve">Bei „Project root </w:t>
-      </w:r>
-      <w:proofErr w:type="spellStart"/>
+        <w:t xml:space="preserve">Bei „Project root directory“ den Ordner auswählen, in dem die </w:t>
+      </w:r>
+      <w:r>
+        <w:rPr>
+          <w:rFonts w:asciiTheme="minorHAnsi" w:hAnsiTheme="minorHAnsi" w:cstheme="minorHAnsi"/>
+          <w:color w:val="ED7D31" w:themeColor="accent2"/>
+          <w:sz w:val="22"/>
+          <w:szCs w:val="22"/>
+          <w:lang w:val="de-DE"/>
+        </w:rPr>
+        <w:t xml:space="preserve">build.gradle </w:t>
+      </w:r>
       <w:r>
         <w:rPr>
           <w:rFonts w:asciiTheme="minorHAnsi" w:hAnsiTheme="minorHAnsi" w:cstheme="minorHAnsi"/>
@@ -2338,82 +1956,7 @@
           <w:szCs w:val="22"/>
           <w:lang w:val="de-DE"/>
         </w:rPr>
-        <w:t>directory</w:t>
-      </w:r>
-      <w:proofErr w:type="spellEnd"/>
-      <w:r>
-        <w:rPr>
-          <w:rFonts w:asciiTheme="minorHAnsi" w:hAnsiTheme="minorHAnsi" w:cstheme="minorHAnsi"/>
-          <w:color w:val="auto"/>
-          <w:sz w:val="22"/>
-          <w:szCs w:val="22"/>
-          <w:lang w:val="de-DE"/>
-        </w:rPr>
-        <w:t xml:space="preserve">“ den Ordner auswählen, in dem die </w:t>
-      </w:r>
-      <w:proofErr w:type="spellStart"/>
-      <w:r>
-        <w:rPr>
-          <w:rFonts w:asciiTheme="minorHAnsi" w:hAnsiTheme="minorHAnsi" w:cstheme="minorHAnsi"/>
-          <w:color w:val="ED7D31" w:themeColor="accent2"/>
-          <w:sz w:val="22"/>
-          <w:szCs w:val="22"/>
-          <w:lang w:val="de-DE"/>
-        </w:rPr>
-        <w:t>build.gradle</w:t>
-      </w:r>
-      <w:proofErr w:type="spellEnd"/>
-      <w:r>
-        <w:rPr>
-          <w:rFonts w:asciiTheme="minorHAnsi" w:hAnsiTheme="minorHAnsi" w:cstheme="minorHAnsi"/>
-          <w:color w:val="ED7D31" w:themeColor="accent2"/>
-          <w:sz w:val="22"/>
-          <w:szCs w:val="22"/>
-          <w:lang w:val="de-DE"/>
-        </w:rPr>
-        <w:t xml:space="preserve"> </w:t>
-      </w:r>
-      <w:r>
-        <w:rPr>
-          <w:rFonts w:asciiTheme="minorHAnsi" w:hAnsiTheme="minorHAnsi" w:cstheme="minorHAnsi"/>
-          <w:color w:val="auto"/>
-          <w:sz w:val="22"/>
-          <w:szCs w:val="22"/>
-          <w:lang w:val="de-DE"/>
-        </w:rPr>
-        <w:t>für das</w:t>
-      </w:r>
-      <w:r>
-        <w:rPr>
-          <w:rFonts w:asciiTheme="minorHAnsi" w:hAnsiTheme="minorHAnsi" w:cstheme="minorHAnsi"/>
-          <w:color w:val="auto"/>
-          <w:sz w:val="22"/>
-          <w:szCs w:val="22"/>
-          <w:lang w:val="de-DE"/>
-        </w:rPr>
-        <w:t xml:space="preserve"> </w:t>
-      </w:r>
-      <w:proofErr w:type="spellStart"/>
-      <w:r>
-        <w:rPr>
-          <w:rFonts w:asciiTheme="minorHAnsi" w:hAnsiTheme="minorHAnsi" w:cstheme="minorHAnsi"/>
-          <w:color w:val="auto"/>
-          <w:sz w:val="22"/>
-          <w:szCs w:val="22"/>
-          <w:lang w:val="de-DE"/>
-        </w:rPr>
-        <w:t>WordCount</w:t>
-      </w:r>
-      <w:proofErr w:type="spellEnd"/>
-      <w:r>
-        <w:rPr>
-          <w:rFonts w:asciiTheme="minorHAnsi" w:hAnsiTheme="minorHAnsi" w:cstheme="minorHAnsi"/>
-          <w:color w:val="auto"/>
-          <w:sz w:val="22"/>
-          <w:szCs w:val="22"/>
-          <w:lang w:val="de-DE"/>
-        </w:rPr>
-        <w:t>-Projekt liegt.</w:t>
+        <w:t>für das WordCount-Projekt liegt.</w:t>
       </w:r>
     </w:p>
     <w:p>
@@ -2449,51 +1992,7 @@
           <w:szCs w:val="22"/>
           <w:lang w:val="de-DE"/>
         </w:rPr>
-        <w:t xml:space="preserve"> </w:t>
-      </w:r>
-      <w:proofErr w:type="spellStart"/>
-      <w:r>
-        <w:rPr>
-          <w:rFonts w:asciiTheme="minorHAnsi" w:hAnsiTheme="minorHAnsi" w:cstheme="minorHAnsi"/>
-          <w:color w:val="auto"/>
-          <w:sz w:val="22"/>
-          <w:szCs w:val="22"/>
-          <w:lang w:val="de-DE"/>
-        </w:rPr>
-        <w:t>Eclipse</w:t>
-      </w:r>
-      <w:proofErr w:type="spellEnd"/>
-      <w:r>
-        <w:rPr>
-          <w:rFonts w:asciiTheme="minorHAnsi" w:hAnsiTheme="minorHAnsi" w:cstheme="minorHAnsi"/>
-          <w:color w:val="auto"/>
-          <w:sz w:val="22"/>
-          <w:szCs w:val="22"/>
-          <w:lang w:val="de-DE"/>
-        </w:rPr>
-        <w:t xml:space="preserve"> liest jetzt das </w:t>
-      </w:r>
-      <w:proofErr w:type="spellStart"/>
-      <w:r>
-        <w:rPr>
-          <w:rFonts w:asciiTheme="minorHAnsi" w:hAnsiTheme="minorHAnsi" w:cstheme="minorHAnsi"/>
-          <w:color w:val="auto"/>
-          <w:sz w:val="22"/>
-          <w:szCs w:val="22"/>
-          <w:lang w:val="de-DE"/>
-        </w:rPr>
-        <w:t>Gradle</w:t>
-      </w:r>
-      <w:proofErr w:type="spellEnd"/>
-      <w:r>
-        <w:rPr>
-          <w:rFonts w:asciiTheme="minorHAnsi" w:hAnsiTheme="minorHAnsi" w:cstheme="minorHAnsi"/>
-          <w:color w:val="auto"/>
-          <w:sz w:val="22"/>
-          <w:szCs w:val="22"/>
-          <w:lang w:val="de-DE"/>
-        </w:rPr>
-        <w:t>-Projekt ein.</w:t>
+        <w:t xml:space="preserve"> Eclipse liest jetzt das Gradle-Projekt ein.</w:t>
       </w:r>
     </w:p>
     <w:p>
@@ -2583,87 +2082,23 @@
           <w:color w:val="C9AE75"/>
           <w:lang w:val="de-DE" w:eastAsia="de-DE"/>
         </w:rPr>
-        <w:t>.</w:t>
-      </w:r>
-      <w:proofErr w:type="spellStart"/>
+        <w:t>.java</w:t>
+      </w:r>
+      <w:r>
+        <w:rPr>
+          <w:rFonts w:ascii="SegoeUI" w:eastAsia="Times New Roman" w:hAnsi="SegoeUI" w:cs="Times New Roman"/>
+          <w:color w:val="000000"/>
+          <w:lang w:val="de-DE" w:eastAsia="de-DE"/>
+        </w:rPr>
+        <w:t xml:space="preserve">Dateien unter </w:t>
+      </w:r>
       <w:r>
         <w:rPr>
           <w:rFonts w:ascii="Consolas" w:eastAsia="Times New Roman" w:hAnsi="Consolas" w:cs="Times New Roman"/>
           <w:color w:val="C9AE75"/>
           <w:lang w:val="de-DE" w:eastAsia="de-DE"/>
         </w:rPr>
-        <w:t>java</w:t>
-      </w:r>
-      <w:r>
-        <w:rPr>
-          <w:rFonts w:ascii="SegoeUI" w:eastAsia="Times New Roman" w:hAnsi="SegoeUI" w:cs="Times New Roman"/>
-          <w:color w:val="000000"/>
-          <w:lang w:val="de-DE" w:eastAsia="de-DE"/>
-        </w:rPr>
-        <w:t>Dateien</w:t>
-      </w:r>
-      <w:proofErr w:type="spellEnd"/>
-      <w:r>
-        <w:rPr>
-          <w:rFonts w:ascii="SegoeUI" w:eastAsia="Times New Roman" w:hAnsi="SegoeUI" w:cs="Times New Roman"/>
-          <w:color w:val="000000"/>
-          <w:lang w:val="de-DE" w:eastAsia="de-DE"/>
-        </w:rPr>
-        <w:t xml:space="preserve"> unter </w:t>
-      </w:r>
-      <w:proofErr w:type="spellStart"/>
-      <w:r>
-        <w:rPr>
-          <w:rFonts w:ascii="Consolas" w:eastAsia="Times New Roman" w:hAnsi="Consolas" w:cs="Times New Roman"/>
-          <w:color w:val="C9AE75"/>
-          <w:lang w:val="de-DE" w:eastAsia="de-DE"/>
-        </w:rPr>
-        <w:t>src</w:t>
-      </w:r>
-      <w:proofErr w:type="spellEnd"/>
-      <w:r>
-        <w:rPr>
-          <w:rFonts w:ascii="Consolas" w:eastAsia="Times New Roman" w:hAnsi="Consolas" w:cs="Times New Roman"/>
-          <w:color w:val="C9AE75"/>
-          <w:lang w:val="de-DE" w:eastAsia="de-DE"/>
-        </w:rPr>
-        <w:t>/</w:t>
-      </w:r>
-      <w:proofErr w:type="spellStart"/>
-      <w:r>
-        <w:rPr>
-          <w:rFonts w:ascii="Consolas" w:eastAsia="Times New Roman" w:hAnsi="Consolas" w:cs="Times New Roman"/>
-          <w:color w:val="C9AE75"/>
-          <w:lang w:val="de-DE" w:eastAsia="de-DE"/>
-        </w:rPr>
-        <w:t>main</w:t>
-      </w:r>
-      <w:proofErr w:type="spellEnd"/>
-      <w:r>
-        <w:rPr>
-          <w:rFonts w:ascii="Consolas" w:eastAsia="Times New Roman" w:hAnsi="Consolas" w:cs="Times New Roman"/>
-          <w:color w:val="C9AE75"/>
-          <w:lang w:val="de-DE" w:eastAsia="de-DE"/>
-        </w:rPr>
-        <w:t>/</w:t>
-      </w:r>
-      <w:proofErr w:type="spellStart"/>
-      <w:r>
-        <w:rPr>
-          <w:rFonts w:ascii="Consolas" w:eastAsia="Times New Roman" w:hAnsi="Consolas" w:cs="Times New Roman"/>
-          <w:color w:val="C9AE75"/>
-          <w:lang w:val="de-DE" w:eastAsia="de-DE"/>
-        </w:rPr>
-        <w:t>java</w:t>
-      </w:r>
-      <w:proofErr w:type="spellEnd"/>
-      <w:r>
-        <w:rPr>
-          <w:rFonts w:ascii="Consolas" w:eastAsia="Times New Roman" w:hAnsi="Consolas" w:cs="Times New Roman"/>
-          <w:color w:val="C9AE75"/>
-          <w:lang w:val="de-DE" w:eastAsia="de-DE"/>
-        </w:rPr>
-        <w:t>/...</w:t>
+        <w:t>src/main/java/...</w:t>
       </w:r>
       <w:r>
         <w:rPr>
@@ -2694,7 +2129,15 @@
           <w:color w:val="000000"/>
           <w:lang w:val="de-DE" w:eastAsia="de-DE"/>
         </w:rPr>
-        <w:t>Wenn dies nicht der Fall, ist, dann einfach</w:t>
+        <w:t xml:space="preserve">Wenn dies nicht der Fall, ist, dann einfach einen Source Folder anlegen und die Dateien dort hin verschieben: Rechtsklick auf Projekt → </w:t>
+      </w:r>
+      <w:r>
+        <w:rPr>
+          <w:rFonts w:ascii="Consolas" w:eastAsia="Times New Roman" w:hAnsi="Consolas" w:cs="Times New Roman"/>
+          <w:color w:val="C9AE75"/>
+          <w:lang w:val="de-DE" w:eastAsia="de-DE"/>
+        </w:rPr>
+        <w:t xml:space="preserve">New </w:t>
       </w:r>
       <w:r>
         <w:rPr>
@@ -2702,112 +2145,40 @@
           <w:color w:val="000000"/>
           <w:lang w:val="de-DE" w:eastAsia="de-DE"/>
         </w:rPr>
-        <w:t xml:space="preserve"> einen Source Folder anlegen und die Dateien </w:t>
-      </w:r>
-      <w:proofErr w:type="spellStart"/>
+        <w:t xml:space="preserve">→ </w:t>
+      </w:r>
+      <w:r>
+        <w:rPr>
+          <w:rFonts w:ascii="Consolas" w:eastAsia="Times New Roman" w:hAnsi="Consolas" w:cs="Times New Roman"/>
+          <w:color w:val="C9AE75"/>
+          <w:lang w:val="de-DE" w:eastAsia="de-DE"/>
+        </w:rPr>
+        <w:t xml:space="preserve">Source Folder </w:t>
+      </w:r>
       <w:r>
         <w:rPr>
           <w:rFonts w:ascii="SegoeUI" w:eastAsia="Times New Roman" w:hAnsi="SegoeUI" w:cs="Times New Roman"/>
           <w:color w:val="000000"/>
           <w:lang w:val="de-DE" w:eastAsia="de-DE"/>
         </w:rPr>
-        <w:t>dort hin</w:t>
-      </w:r>
-      <w:proofErr w:type="spellEnd"/>
+        <w:t xml:space="preserve">→ Name: </w:t>
+      </w:r>
+      <w:r>
+        <w:rPr>
+          <w:rFonts w:ascii="Consolas" w:eastAsia="Times New Roman" w:hAnsi="Consolas" w:cs="Times New Roman"/>
+          <w:color w:val="C9AE75"/>
+          <w:lang w:val="de-DE" w:eastAsia="de-DE"/>
+        </w:rPr>
+        <w:t>src/main/java</w:t>
+      </w:r>
       <w:r>
         <w:rPr>
           <w:rFonts w:ascii="SegoeUI" w:eastAsia="Times New Roman" w:hAnsi="SegoeUI" w:cs="Times New Roman"/>
           <w:color w:val="000000"/>
           <w:lang w:val="de-DE" w:eastAsia="de-DE"/>
         </w:rPr>
-        <w:t xml:space="preserve"> verschieben: Rechtsklick auf Projekt → </w:t>
-      </w:r>
-      <w:r>
-        <w:rPr>
-          <w:rFonts w:ascii="Consolas" w:eastAsia="Times New Roman" w:hAnsi="Consolas" w:cs="Times New Roman"/>
-          <w:color w:val="C9AE75"/>
-          <w:lang w:val="de-DE" w:eastAsia="de-DE"/>
-        </w:rPr>
-        <w:t xml:space="preserve">New </w:t>
-      </w:r>
-      <w:r>
-        <w:rPr>
-          <w:rFonts w:ascii="SegoeUI" w:eastAsia="Times New Roman" w:hAnsi="SegoeUI" w:cs="Times New Roman"/>
-          <w:color w:val="000000"/>
-          <w:lang w:val="de-DE" w:eastAsia="de-DE"/>
-        </w:rPr>
-        <w:t xml:space="preserve">→ </w:t>
-      </w:r>
-      <w:r>
-        <w:rPr>
-          <w:rFonts w:ascii="Consolas" w:eastAsia="Times New Roman" w:hAnsi="Consolas" w:cs="Times New Roman"/>
-          <w:color w:val="C9AE75"/>
-          <w:lang w:val="de-DE" w:eastAsia="de-DE"/>
-        </w:rPr>
-        <w:t xml:space="preserve">Source Folder </w:t>
-      </w:r>
-      <w:r>
-        <w:rPr>
-          <w:rFonts w:ascii="SegoeUI" w:eastAsia="Times New Roman" w:hAnsi="SegoeUI" w:cs="Times New Roman"/>
-          <w:color w:val="000000"/>
-          <w:lang w:val="de-DE" w:eastAsia="de-DE"/>
-        </w:rPr>
-        <w:t xml:space="preserve">→ Name: </w:t>
-      </w:r>
-      <w:proofErr w:type="spellStart"/>
-      <w:r>
-        <w:rPr>
-          <w:rFonts w:ascii="Consolas" w:eastAsia="Times New Roman" w:hAnsi="Consolas" w:cs="Times New Roman"/>
-          <w:color w:val="C9AE75"/>
-          <w:lang w:val="de-DE" w:eastAsia="de-DE"/>
-        </w:rPr>
-        <w:t>src</w:t>
-      </w:r>
-      <w:proofErr w:type="spellEnd"/>
-      <w:r>
-        <w:rPr>
-          <w:rFonts w:ascii="Consolas" w:eastAsia="Times New Roman" w:hAnsi="Consolas" w:cs="Times New Roman"/>
-          <w:color w:val="C9AE75"/>
-          <w:lang w:val="de-DE" w:eastAsia="de-DE"/>
-        </w:rPr>
-        <w:t>/</w:t>
-      </w:r>
-      <w:proofErr w:type="spellStart"/>
-      <w:r>
-        <w:rPr>
-          <w:rFonts w:ascii="Consolas" w:eastAsia="Times New Roman" w:hAnsi="Consolas" w:cs="Times New Roman"/>
-          <w:color w:val="C9AE75"/>
-          <w:lang w:val="de-DE" w:eastAsia="de-DE"/>
-        </w:rPr>
-        <w:t>main</w:t>
-      </w:r>
-      <w:proofErr w:type="spellEnd"/>
-      <w:r>
-        <w:rPr>
-          <w:rFonts w:ascii="Consolas" w:eastAsia="Times New Roman" w:hAnsi="Consolas" w:cs="Times New Roman"/>
-          <w:color w:val="C9AE75"/>
-          <w:lang w:val="de-DE" w:eastAsia="de-DE"/>
-        </w:rPr>
-        <w:t>/</w:t>
-      </w:r>
-      <w:proofErr w:type="spellStart"/>
-      <w:r>
-        <w:rPr>
-          <w:rFonts w:ascii="Consolas" w:eastAsia="Times New Roman" w:hAnsi="Consolas" w:cs="Times New Roman"/>
-          <w:color w:val="C9AE75"/>
-          <w:lang w:val="de-DE" w:eastAsia="de-DE"/>
-        </w:rPr>
-        <w:t>java</w:t>
-      </w:r>
-      <w:r>
-        <w:rPr>
-          <w:rFonts w:ascii="SegoeUI" w:eastAsia="Times New Roman" w:hAnsi="SegoeUI" w:cs="Times New Roman"/>
-          <w:color w:val="000000"/>
-          <w:lang w:val="de-DE" w:eastAsia="de-DE"/>
-        </w:rPr>
         <w:t>.</w:t>
       </w:r>
-      <w:proofErr w:type="spellEnd"/>
     </w:p>
     <w:p>
       <w:pPr>
@@ -2831,57 +2202,29 @@
         </w:rPr>
         <w:t xml:space="preserve">Damit die Einstellungen übernommen werden: Rechtsklick auf das Projekt → </w:t>
       </w:r>
-      <w:proofErr w:type="spellStart"/>
       <w:r>
         <w:rPr>
           <w:rFonts w:ascii="Consolas" w:eastAsia="Times New Roman" w:hAnsi="Consolas" w:cs="Times New Roman"/>
           <w:color w:val="C9AE75"/>
           <w:lang w:val="de-DE" w:eastAsia="de-DE"/>
         </w:rPr>
-        <w:t>Gradle</w:t>
-      </w:r>
-      <w:proofErr w:type="spellEnd"/>
+        <w:t xml:space="preserve">Gradle </w:t>
+      </w:r>
+      <w:r>
+        <w:rPr>
+          <w:rFonts w:ascii="SegoeUI" w:eastAsia="Times New Roman" w:hAnsi="SegoeUI" w:cs="Times New Roman"/>
+          <w:color w:val="000000"/>
+          <w:lang w:val="de-DE" w:eastAsia="de-DE"/>
+        </w:rPr>
+        <w:t xml:space="preserve">→ </w:t>
+      </w:r>
       <w:r>
         <w:rPr>
           <w:rFonts w:ascii="Consolas" w:eastAsia="Times New Roman" w:hAnsi="Consolas" w:cs="Times New Roman"/>
           <w:color w:val="C9AE75"/>
           <w:lang w:val="de-DE" w:eastAsia="de-DE"/>
         </w:rPr>
-        <w:t xml:space="preserve"> </w:t>
-      </w:r>
-      <w:r>
-        <w:rPr>
-          <w:rFonts w:ascii="SegoeUI" w:eastAsia="Times New Roman" w:hAnsi="SegoeUI" w:cs="Times New Roman"/>
-          <w:color w:val="000000"/>
-          <w:lang w:val="de-DE" w:eastAsia="de-DE"/>
-        </w:rPr>
-        <w:t xml:space="preserve">→ </w:t>
-      </w:r>
-      <w:r>
-        <w:rPr>
-          <w:rFonts w:ascii="Consolas" w:eastAsia="Times New Roman" w:hAnsi="Consolas" w:cs="Times New Roman"/>
-          <w:color w:val="C9AE75"/>
-          <w:lang w:val="de-DE" w:eastAsia="de-DE"/>
-        </w:rPr>
-        <w:t xml:space="preserve">Refresh </w:t>
-      </w:r>
-      <w:proofErr w:type="spellStart"/>
-      <w:r>
-        <w:rPr>
-          <w:rFonts w:ascii="Consolas" w:eastAsia="Times New Roman" w:hAnsi="Consolas" w:cs="Times New Roman"/>
-          <w:color w:val="C9AE75"/>
-          <w:lang w:val="de-DE" w:eastAsia="de-DE"/>
-        </w:rPr>
-        <w:t>Gradle</w:t>
-      </w:r>
-      <w:proofErr w:type="spellEnd"/>
-      <w:r>
-        <w:rPr>
-          <w:rFonts w:ascii="Consolas" w:eastAsia="Times New Roman" w:hAnsi="Consolas" w:cs="Times New Roman"/>
-          <w:color w:val="C9AE75"/>
-          <w:lang w:val="de-DE" w:eastAsia="de-DE"/>
-        </w:rPr>
-        <w:t xml:space="preserve"> Project</w:t>
+        <w:t>Refresh Gradle Project</w:t>
       </w:r>
       <w:r>
         <w:rPr>
@@ -2914,49 +2257,29 @@
         </w:rPr>
         <w:t xml:space="preserve">Die Hadoop-Bibliotheken werden automatisch über die </w:t>
       </w:r>
-      <w:proofErr w:type="spellStart"/>
       <w:r>
         <w:rPr>
           <w:rFonts w:ascii="Consolas" w:eastAsia="Times New Roman" w:hAnsi="Consolas" w:cs="Times New Roman"/>
           <w:color w:val="C9AE75"/>
           <w:lang w:val="de-DE" w:eastAsia="de-DE"/>
         </w:rPr>
-        <w:t>dependencies</w:t>
-      </w:r>
-      <w:proofErr w:type="spellEnd"/>
+        <w:t xml:space="preserve">dependencies </w:t>
+      </w:r>
+      <w:r>
+        <w:rPr>
+          <w:rFonts w:ascii="SegoeUI" w:eastAsia="Times New Roman" w:hAnsi="SegoeUI" w:cs="Times New Roman"/>
+          <w:color w:val="000000"/>
+          <w:lang w:val="de-DE" w:eastAsia="de-DE"/>
+        </w:rPr>
+        <w:t xml:space="preserve">in der </w:t>
+      </w:r>
       <w:r>
         <w:rPr>
           <w:rFonts w:ascii="Consolas" w:eastAsia="Times New Roman" w:hAnsi="Consolas" w:cs="Times New Roman"/>
           <w:color w:val="C9AE75"/>
           <w:lang w:val="de-DE" w:eastAsia="de-DE"/>
         </w:rPr>
-        <w:t xml:space="preserve"> </w:t>
-      </w:r>
-      <w:r>
-        <w:rPr>
-          <w:rFonts w:ascii="SegoeUI" w:eastAsia="Times New Roman" w:hAnsi="SegoeUI" w:cs="Times New Roman"/>
-          <w:color w:val="000000"/>
-          <w:lang w:val="de-DE" w:eastAsia="de-DE"/>
-        </w:rPr>
-        <w:t xml:space="preserve">in der </w:t>
-      </w:r>
-      <w:proofErr w:type="spellStart"/>
-      <w:r>
-        <w:rPr>
-          <w:rFonts w:ascii="Consolas" w:eastAsia="Times New Roman" w:hAnsi="Consolas" w:cs="Times New Roman"/>
-          <w:color w:val="C9AE75"/>
-          <w:lang w:val="de-DE" w:eastAsia="de-DE"/>
-        </w:rPr>
-        <w:t>build.gradle</w:t>
-      </w:r>
-      <w:proofErr w:type="spellEnd"/>
-      <w:r>
-        <w:rPr>
-          <w:rFonts w:ascii="Consolas" w:eastAsia="Times New Roman" w:hAnsi="Consolas" w:cs="Times New Roman"/>
-          <w:color w:val="C9AE75"/>
-          <w:lang w:val="de-DE" w:eastAsia="de-DE"/>
-        </w:rPr>
-        <w:t xml:space="preserve"> </w:t>
+        <w:t xml:space="preserve">build.gradle </w:t>
       </w:r>
       <w:r>
         <w:rPr>
@@ -3004,29 +2327,7 @@
           <w:color w:val="000000"/>
           <w:lang w:val="de-DE" w:eastAsia="de-DE"/>
         </w:rPr>
-        <w:t xml:space="preserve">. Projekt über den </w:t>
-      </w:r>
-      <w:proofErr w:type="spellStart"/>
-      <w:r>
-        <w:rPr>
-          <w:rFonts w:ascii="SegoeUI-Bold" w:eastAsia="Times New Roman" w:hAnsi="SegoeUI-Bold" w:cs="Times New Roman"/>
-          <w:b/>
-          <w:bCs/>
-          <w:color w:val="000000"/>
-          <w:lang w:val="de-DE" w:eastAsia="de-DE"/>
-        </w:rPr>
-        <w:t>Gradle</w:t>
-      </w:r>
-      <w:proofErr w:type="spellEnd"/>
-      <w:r>
-        <w:rPr>
-          <w:rFonts w:ascii="SegoeUI-Bold" w:eastAsia="Times New Roman" w:hAnsi="SegoeUI-Bold" w:cs="Times New Roman"/>
-          <w:b/>
-          <w:bCs/>
-          <w:color w:val="000000"/>
-          <w:lang w:val="de-DE" w:eastAsia="de-DE"/>
-        </w:rPr>
-        <w:t xml:space="preserve"> Tasks View bauen und Jar erstellen</w:t>
+        <w:t>. Projekt über den Gradle Tasks View bauen und Jar erstellen</w:t>
       </w:r>
     </w:p>
     <w:p>
@@ -3045,25 +2346,39 @@
           <w:color w:val="000000"/>
           <w:lang w:val="en-US" w:eastAsia="de-DE"/>
         </w:rPr>
-        <w:t xml:space="preserve">1. </w:t>
-      </w:r>
-      <w:proofErr w:type="spellStart"/>
+        <w:t xml:space="preserve">1. Menü </w:t>
+      </w:r>
+      <w:r>
+        <w:rPr>
+          <w:rFonts w:ascii="Consolas" w:eastAsia="Times New Roman" w:hAnsi="Consolas" w:cs="Times New Roman"/>
+          <w:color w:val="C9AE75"/>
+          <w:lang w:val="en-US" w:eastAsia="de-DE"/>
+        </w:rPr>
+        <w:t xml:space="preserve">Window </w:t>
+      </w:r>
       <w:r>
         <w:rPr>
           <w:rFonts w:ascii="SegoeUI" w:eastAsia="Times New Roman" w:hAnsi="SegoeUI" w:cs="Times New Roman"/>
           <w:color w:val="000000"/>
           <w:lang w:val="en-US" w:eastAsia="de-DE"/>
         </w:rPr>
-        <w:t>Menü</w:t>
-      </w:r>
-      <w:proofErr w:type="spellEnd"/>
+        <w:t xml:space="preserve">→ </w:t>
+      </w:r>
+      <w:r>
+        <w:rPr>
+          <w:rFonts w:ascii="Consolas" w:eastAsia="Times New Roman" w:hAnsi="Consolas" w:cs="Times New Roman"/>
+          <w:color w:val="C9AE75"/>
+          <w:lang w:val="en-US" w:eastAsia="de-DE"/>
+        </w:rPr>
+        <w:t xml:space="preserve">Show View </w:t>
+      </w:r>
       <w:r>
         <w:rPr>
           <w:rFonts w:ascii="SegoeUI" w:eastAsia="Times New Roman" w:hAnsi="SegoeUI" w:cs="Times New Roman"/>
           <w:color w:val="000000"/>
           <w:lang w:val="en-US" w:eastAsia="de-DE"/>
         </w:rPr>
-        <w:t xml:space="preserve"> </w:t>
+        <w:t xml:space="preserve">→ </w:t>
       </w:r>
       <w:r>
         <w:rPr>
@@ -3071,7 +2386,7 @@
           <w:color w:val="C9AE75"/>
           <w:lang w:val="en-US" w:eastAsia="de-DE"/>
         </w:rPr>
-        <w:t xml:space="preserve">Window </w:t>
+        <w:t>Other…</w:t>
       </w:r>
       <w:r>
         <w:rPr>
@@ -3079,21 +2394,40 @@
           <w:color w:val="000000"/>
           <w:lang w:val="en-US" w:eastAsia="de-DE"/>
         </w:rPr>
-        <w:t xml:space="preserve">→ </w:t>
+        <w:t>.</w:t>
+      </w:r>
+    </w:p>
+    <w:p>
+      <w:pPr>
+        <w:spacing w:after="0" w:line="240" w:lineRule="auto"/>
+        <w:ind w:firstLine="708"/>
+        <w:rPr>
+          <w:rFonts w:ascii="SegoeUI" w:eastAsia="Times New Roman" w:hAnsi="SegoeUI" w:cs="Times New Roman"/>
+          <w:color w:val="000000"/>
+          <w:lang w:val="de-DE" w:eastAsia="de-DE"/>
+        </w:rPr>
+      </w:pPr>
+      <w:r>
+        <w:rPr>
+          <w:rFonts w:ascii="SegoeUI" w:eastAsia="Times New Roman" w:hAnsi="SegoeUI" w:cs="Times New Roman"/>
+          <w:color w:val="000000"/>
+          <w:lang w:val="de-DE" w:eastAsia="de-DE"/>
+        </w:rPr>
+        <w:t xml:space="preserve">2. Kategorie </w:t>
       </w:r>
       <w:r>
         <w:rPr>
           <w:rFonts w:ascii="Consolas" w:eastAsia="Times New Roman" w:hAnsi="Consolas" w:cs="Times New Roman"/>
           <w:color w:val="C9AE75"/>
-          <w:lang w:val="en-US" w:eastAsia="de-DE"/>
-        </w:rPr>
-        <w:t xml:space="preserve">Show View </w:t>
+          <w:lang w:val="de-DE" w:eastAsia="de-DE"/>
+        </w:rPr>
+        <w:t xml:space="preserve">Gradle </w:t>
       </w:r>
       <w:r>
         <w:rPr>
           <w:rFonts w:ascii="SegoeUI" w:eastAsia="Times New Roman" w:hAnsi="SegoeUI" w:cs="Times New Roman"/>
           <w:color w:val="000000"/>
-          <w:lang w:val="en-US" w:eastAsia="de-DE"/>
+          <w:lang w:val="de-DE" w:eastAsia="de-DE"/>
         </w:rPr>
         <w:t xml:space="preserve">→ </w:t>
       </w:r>
@@ -3101,15 +2435,15 @@
         <w:rPr>
           <w:rFonts w:ascii="Consolas" w:eastAsia="Times New Roman" w:hAnsi="Consolas" w:cs="Times New Roman"/>
           <w:color w:val="C9AE75"/>
-          <w:lang w:val="en-US" w:eastAsia="de-DE"/>
-        </w:rPr>
-        <w:t>Other…</w:t>
+          <w:lang w:val="de-DE" w:eastAsia="de-DE"/>
+        </w:rPr>
+        <w:t>Gradle Tasks</w:t>
       </w:r>
       <w:r>
         <w:rPr>
           <w:rFonts w:ascii="SegoeUI" w:eastAsia="Times New Roman" w:hAnsi="SegoeUI" w:cs="Times New Roman"/>
           <w:color w:val="000000"/>
-          <w:lang w:val="en-US" w:eastAsia="de-DE"/>
+          <w:lang w:val="de-DE" w:eastAsia="de-DE"/>
         </w:rPr>
         <w:t>.</w:t>
       </w:r>
@@ -3130,25 +2464,50 @@
           <w:color w:val="000000"/>
           <w:lang w:val="de-DE" w:eastAsia="de-DE"/>
         </w:rPr>
-        <w:t xml:space="preserve">2. Kategorie </w:t>
-      </w:r>
-      <w:proofErr w:type="spellStart"/>
+        <w:t>3. In der „Gradle Tasks“-Ansicht das Projekt auswählen.</w:t>
+      </w:r>
+    </w:p>
+    <w:p>
+      <w:pPr>
+        <w:spacing w:after="0" w:line="240" w:lineRule="auto"/>
+        <w:ind w:firstLine="708"/>
+        <w:rPr>
+          <w:rFonts w:ascii="SegoeUI" w:eastAsia="Times New Roman" w:hAnsi="SegoeUI" w:cs="Times New Roman"/>
+          <w:color w:val="000000"/>
+          <w:lang w:val="de-DE" w:eastAsia="de-DE"/>
+        </w:rPr>
+      </w:pPr>
+      <w:r>
+        <w:rPr>
+          <w:rFonts w:ascii="SegoeUI" w:eastAsia="Times New Roman" w:hAnsi="SegoeUI" w:cs="Times New Roman"/>
+          <w:color w:val="000000"/>
+          <w:lang w:val="de-DE" w:eastAsia="de-DE"/>
+        </w:rPr>
+        <w:t xml:space="preserve">4. Unter der Gruppe </w:t>
+      </w:r>
       <w:r>
         <w:rPr>
           <w:rFonts w:ascii="Consolas" w:eastAsia="Times New Roman" w:hAnsi="Consolas" w:cs="Times New Roman"/>
           <w:color w:val="C9AE75"/>
           <w:lang w:val="de-DE" w:eastAsia="de-DE"/>
         </w:rPr>
-        <w:t>Gradle</w:t>
-      </w:r>
-      <w:proofErr w:type="spellEnd"/>
+        <w:t xml:space="preserve">build </w:t>
+      </w:r>
+      <w:r>
+        <w:rPr>
+          <w:rFonts w:ascii="SegoeUI" w:eastAsia="Times New Roman" w:hAnsi="SegoeUI" w:cs="Times New Roman"/>
+          <w:color w:val="000000"/>
+          <w:lang w:val="de-DE" w:eastAsia="de-DE"/>
+        </w:rPr>
+        <w:t xml:space="preserve">entweder </w:t>
+      </w:r>
       <w:r>
         <w:rPr>
           <w:rFonts w:ascii="Consolas" w:eastAsia="Times New Roman" w:hAnsi="Consolas" w:cs="Times New Roman"/>
           <w:color w:val="C9AE75"/>
           <w:lang w:val="de-DE" w:eastAsia="de-DE"/>
         </w:rPr>
-        <w:t xml:space="preserve"> </w:t>
+        <w:t xml:space="preserve">build </w:t>
       </w:r>
       <w:r>
         <w:rPr>
@@ -3156,25 +2515,53 @@
           <w:color w:val="000000"/>
           <w:lang w:val="de-DE" w:eastAsia="de-DE"/>
         </w:rPr>
-        <w:t xml:space="preserve">→ </w:t>
-      </w:r>
-      <w:proofErr w:type="spellStart"/>
+        <w:t xml:space="preserve">oder </w:t>
+      </w:r>
       <w:r>
         <w:rPr>
           <w:rFonts w:ascii="Consolas" w:eastAsia="Times New Roman" w:hAnsi="Consolas" w:cs="Times New Roman"/>
           <w:color w:val="C9AE75"/>
           <w:lang w:val="de-DE" w:eastAsia="de-DE"/>
         </w:rPr>
-        <w:t>Gradle</w:t>
-      </w:r>
-      <w:proofErr w:type="spellEnd"/>
+        <w:t xml:space="preserve">jar </w:t>
+      </w:r>
+      <w:r>
+        <w:rPr>
+          <w:rFonts w:ascii="SegoeUI" w:eastAsia="Times New Roman" w:hAnsi="SegoeUI" w:cs="Times New Roman"/>
+          <w:color w:val="000000"/>
+          <w:lang w:val="de-DE" w:eastAsia="de-DE"/>
+        </w:rPr>
+        <w:t>wählen.</w:t>
+      </w:r>
+    </w:p>
+    <w:p>
+      <w:pPr>
+        <w:pStyle w:val="Listenabsatz"/>
+        <w:ind w:left="360"/>
+      </w:pPr>
+      <w:r>
+        <w:rPr>
+          <w:rFonts w:ascii="SegoeUI" w:eastAsia="Times New Roman" w:hAnsi="SegoeUI" w:cs="Times New Roman"/>
+          <w:color w:val="000000"/>
+          <w:lang w:val="de-DE" w:eastAsia="de-DE"/>
+        </w:rPr>
+        <w:br/>
+      </w:r>
+      <w:r>
+        <w:rPr>
+          <w:rFonts w:ascii="SegoeUI" w:eastAsia="Times New Roman" w:hAnsi="SegoeUI" w:cs="Times New Roman"/>
+          <w:color w:val="000000"/>
+          <w:lang w:val="de-DE" w:eastAsia="de-DE"/>
+        </w:rPr>
+        <w:t xml:space="preserve">Standardmäßig erzeugt Gradle das Jar unter dem Pfad </w:t>
+      </w:r>
       <w:r>
         <w:rPr>
           <w:rFonts w:ascii="Consolas" w:eastAsia="Times New Roman" w:hAnsi="Consolas" w:cs="Times New Roman"/>
           <w:color w:val="C9AE75"/>
           <w:lang w:val="de-DE" w:eastAsia="de-DE"/>
         </w:rPr>
-        <w:t xml:space="preserve"> Tasks</w:t>
+        <w:t>build/libs/&lt;projektname&gt;- &lt;version&gt;.jar</w:t>
       </w:r>
       <w:r>
         <w:rPr>
@@ -3182,307 +2569,15 @@
           <w:color w:val="000000"/>
           <w:lang w:val="de-DE" w:eastAsia="de-DE"/>
         </w:rPr>
-        <w:t>.</w:t>
-      </w:r>
-    </w:p>
-    <w:p>
-      <w:pPr>
-        <w:spacing w:after="0" w:line="240" w:lineRule="auto"/>
-        <w:ind w:firstLine="708"/>
-        <w:rPr>
-          <w:rFonts w:ascii="SegoeUI" w:eastAsia="Times New Roman" w:hAnsi="SegoeUI" w:cs="Times New Roman"/>
-          <w:color w:val="000000"/>
-          <w:lang w:val="de-DE" w:eastAsia="de-DE"/>
-        </w:rPr>
-      </w:pPr>
-      <w:r>
-        <w:rPr>
-          <w:rFonts w:ascii="SegoeUI" w:eastAsia="Times New Roman" w:hAnsi="SegoeUI" w:cs="Times New Roman"/>
-          <w:color w:val="000000"/>
-          <w:lang w:val="de-DE" w:eastAsia="de-DE"/>
-        </w:rPr>
-        <w:t>3. In der „</w:t>
-      </w:r>
-      <w:proofErr w:type="spellStart"/>
-      <w:r>
-        <w:rPr>
-          <w:rFonts w:ascii="SegoeUI" w:eastAsia="Times New Roman" w:hAnsi="SegoeUI" w:cs="Times New Roman"/>
-          <w:color w:val="000000"/>
-          <w:lang w:val="de-DE" w:eastAsia="de-DE"/>
-        </w:rPr>
-        <w:t>Gradle</w:t>
-      </w:r>
-      <w:proofErr w:type="spellEnd"/>
-      <w:r>
-        <w:rPr>
-          <w:rFonts w:ascii="SegoeUI" w:eastAsia="Times New Roman" w:hAnsi="SegoeUI" w:cs="Times New Roman"/>
-          <w:color w:val="000000"/>
-          <w:lang w:val="de-DE" w:eastAsia="de-DE"/>
-        </w:rPr>
-        <w:t xml:space="preserve"> Tasks“-Ansicht das Projekt auswählen.</w:t>
-      </w:r>
-    </w:p>
-    <w:p>
-      <w:pPr>
-        <w:spacing w:after="0" w:line="240" w:lineRule="auto"/>
-        <w:ind w:firstLine="708"/>
-        <w:rPr>
-          <w:rFonts w:ascii="SegoeUI" w:eastAsia="Times New Roman" w:hAnsi="SegoeUI" w:cs="Times New Roman"/>
-          <w:color w:val="000000"/>
-          <w:lang w:val="de-DE" w:eastAsia="de-DE"/>
-        </w:rPr>
-      </w:pPr>
-      <w:r>
-        <w:rPr>
-          <w:rFonts w:ascii="SegoeUI" w:eastAsia="Times New Roman" w:hAnsi="SegoeUI" w:cs="Times New Roman"/>
-          <w:color w:val="000000"/>
-          <w:lang w:val="de-DE" w:eastAsia="de-DE"/>
-        </w:rPr>
-        <w:t xml:space="preserve">4. Unter der Gruppe </w:t>
-      </w:r>
-      <w:proofErr w:type="spellStart"/>
+        <w:t xml:space="preserve">. In diesem Fall unter </w:t>
+      </w:r>
       <w:r>
         <w:rPr>
           <w:rFonts w:ascii="Consolas" w:eastAsia="Times New Roman" w:hAnsi="Consolas" w:cs="Times New Roman"/>
           <w:color w:val="C9AE75"/>
           <w:lang w:val="de-DE" w:eastAsia="de-DE"/>
         </w:rPr>
-        <w:t>build</w:t>
-      </w:r>
-      <w:proofErr w:type="spellEnd"/>
-      <w:r>
-        <w:rPr>
-          <w:rFonts w:ascii="Consolas" w:eastAsia="Times New Roman" w:hAnsi="Consolas" w:cs="Times New Roman"/>
-          <w:color w:val="C9AE75"/>
-          <w:lang w:val="de-DE" w:eastAsia="de-DE"/>
-        </w:rPr>
-        <w:t xml:space="preserve"> </w:t>
-      </w:r>
-      <w:r>
-        <w:rPr>
-          <w:rFonts w:ascii="SegoeUI" w:eastAsia="Times New Roman" w:hAnsi="SegoeUI" w:cs="Times New Roman"/>
-          <w:color w:val="000000"/>
-          <w:lang w:val="de-DE" w:eastAsia="de-DE"/>
-        </w:rPr>
-        <w:t xml:space="preserve">entweder </w:t>
-      </w:r>
-      <w:proofErr w:type="spellStart"/>
-      <w:r>
-        <w:rPr>
-          <w:rFonts w:ascii="Consolas" w:eastAsia="Times New Roman" w:hAnsi="Consolas" w:cs="Times New Roman"/>
-          <w:color w:val="C9AE75"/>
-          <w:lang w:val="de-DE" w:eastAsia="de-DE"/>
-        </w:rPr>
-        <w:t>build</w:t>
-      </w:r>
-      <w:proofErr w:type="spellEnd"/>
-      <w:r>
-        <w:rPr>
-          <w:rFonts w:ascii="Consolas" w:eastAsia="Times New Roman" w:hAnsi="Consolas" w:cs="Times New Roman"/>
-          <w:color w:val="C9AE75"/>
-          <w:lang w:val="de-DE" w:eastAsia="de-DE"/>
-        </w:rPr>
-        <w:t xml:space="preserve"> </w:t>
-      </w:r>
-      <w:r>
-        <w:rPr>
-          <w:rFonts w:ascii="SegoeUI" w:eastAsia="Times New Roman" w:hAnsi="SegoeUI" w:cs="Times New Roman"/>
-          <w:color w:val="000000"/>
-          <w:lang w:val="de-DE" w:eastAsia="de-DE"/>
-        </w:rPr>
-        <w:t xml:space="preserve">oder </w:t>
-      </w:r>
-      <w:proofErr w:type="spellStart"/>
-      <w:r>
-        <w:rPr>
-          <w:rFonts w:ascii="Consolas" w:eastAsia="Times New Roman" w:hAnsi="Consolas" w:cs="Times New Roman"/>
-          <w:color w:val="C9AE75"/>
-          <w:lang w:val="de-DE" w:eastAsia="de-DE"/>
-        </w:rPr>
-        <w:t>jar</w:t>
-      </w:r>
-      <w:proofErr w:type="spellEnd"/>
-      <w:r>
-        <w:rPr>
-          <w:rFonts w:ascii="Consolas" w:eastAsia="Times New Roman" w:hAnsi="Consolas" w:cs="Times New Roman"/>
-          <w:color w:val="C9AE75"/>
-          <w:lang w:val="de-DE" w:eastAsia="de-DE"/>
-        </w:rPr>
-        <w:t xml:space="preserve"> </w:t>
-      </w:r>
-      <w:r>
-        <w:rPr>
-          <w:rFonts w:ascii="SegoeUI" w:eastAsia="Times New Roman" w:hAnsi="SegoeUI" w:cs="Times New Roman"/>
-          <w:color w:val="000000"/>
-          <w:lang w:val="de-DE" w:eastAsia="de-DE"/>
-        </w:rPr>
-        <w:t>wählen.</w:t>
-      </w:r>
-    </w:p>
-    <w:p>
-      <w:pPr>
-        <w:pStyle w:val="Listenabsatz"/>
-        <w:ind w:left="360"/>
-      </w:pPr>
-      <w:r>
-        <w:rPr>
-          <w:rFonts w:ascii="SegoeUI" w:eastAsia="Times New Roman" w:hAnsi="SegoeUI" w:cs="Times New Roman"/>
-          <w:color w:val="000000"/>
-          <w:lang w:val="de-DE" w:eastAsia="de-DE"/>
-        </w:rPr>
-        <w:br/>
-      </w:r>
-      <w:r>
-        <w:rPr>
-          <w:rFonts w:ascii="SegoeUI" w:eastAsia="Times New Roman" w:hAnsi="SegoeUI" w:cs="Times New Roman"/>
-          <w:color w:val="000000"/>
-          <w:lang w:val="de-DE" w:eastAsia="de-DE"/>
-        </w:rPr>
-        <w:t xml:space="preserve">Standardmäßig erzeugt </w:t>
-      </w:r>
-      <w:proofErr w:type="spellStart"/>
-      <w:r>
-        <w:rPr>
-          <w:rFonts w:ascii="SegoeUI" w:eastAsia="Times New Roman" w:hAnsi="SegoeUI" w:cs="Times New Roman"/>
-          <w:color w:val="000000"/>
-          <w:lang w:val="de-DE" w:eastAsia="de-DE"/>
-        </w:rPr>
-        <w:t>Gradle</w:t>
-      </w:r>
-      <w:proofErr w:type="spellEnd"/>
-      <w:r>
-        <w:rPr>
-          <w:rFonts w:ascii="SegoeUI" w:eastAsia="Times New Roman" w:hAnsi="SegoeUI" w:cs="Times New Roman"/>
-          <w:color w:val="000000"/>
-          <w:lang w:val="de-DE" w:eastAsia="de-DE"/>
-        </w:rPr>
-        <w:t xml:space="preserve"> das Jar unter dem Pfad </w:t>
-      </w:r>
-      <w:proofErr w:type="spellStart"/>
-      <w:r>
-        <w:rPr>
-          <w:rFonts w:ascii="Consolas" w:eastAsia="Times New Roman" w:hAnsi="Consolas" w:cs="Times New Roman"/>
-          <w:color w:val="C9AE75"/>
-          <w:lang w:val="de-DE" w:eastAsia="de-DE"/>
-        </w:rPr>
-        <w:t>build</w:t>
-      </w:r>
-      <w:proofErr w:type="spellEnd"/>
-      <w:r>
-        <w:rPr>
-          <w:rFonts w:ascii="Consolas" w:eastAsia="Times New Roman" w:hAnsi="Consolas" w:cs="Times New Roman"/>
-          <w:color w:val="C9AE75"/>
-          <w:lang w:val="de-DE" w:eastAsia="de-DE"/>
-        </w:rPr>
-        <w:t>/</w:t>
-      </w:r>
-      <w:proofErr w:type="spellStart"/>
-      <w:r>
-        <w:rPr>
-          <w:rFonts w:ascii="Consolas" w:eastAsia="Times New Roman" w:hAnsi="Consolas" w:cs="Times New Roman"/>
-          <w:color w:val="C9AE75"/>
-          <w:lang w:val="de-DE" w:eastAsia="de-DE"/>
-        </w:rPr>
-        <w:t>libs</w:t>
-      </w:r>
-      <w:proofErr w:type="spellEnd"/>
-      <w:r>
-        <w:rPr>
-          <w:rFonts w:ascii="Consolas" w:eastAsia="Times New Roman" w:hAnsi="Consolas" w:cs="Times New Roman"/>
-          <w:color w:val="C9AE75"/>
-          <w:lang w:val="de-DE" w:eastAsia="de-DE"/>
-        </w:rPr>
-        <w:t>/&lt;</w:t>
-      </w:r>
-      <w:proofErr w:type="spellStart"/>
-      <w:r>
-        <w:rPr>
-          <w:rFonts w:ascii="Consolas" w:eastAsia="Times New Roman" w:hAnsi="Consolas" w:cs="Times New Roman"/>
-          <w:color w:val="C9AE75"/>
-          <w:lang w:val="de-DE" w:eastAsia="de-DE"/>
-        </w:rPr>
-        <w:t>projektname</w:t>
-      </w:r>
-      <w:proofErr w:type="spellEnd"/>
-      <w:r>
-        <w:rPr>
-          <w:rFonts w:ascii="Consolas" w:eastAsia="Times New Roman" w:hAnsi="Consolas" w:cs="Times New Roman"/>
-          <w:color w:val="C9AE75"/>
-          <w:lang w:val="de-DE" w:eastAsia="de-DE"/>
-        </w:rPr>
-        <w:t>&gt;- &lt;</w:t>
-      </w:r>
-      <w:proofErr w:type="spellStart"/>
-      <w:r>
-        <w:rPr>
-          <w:rFonts w:ascii="Consolas" w:eastAsia="Times New Roman" w:hAnsi="Consolas" w:cs="Times New Roman"/>
-          <w:color w:val="C9AE75"/>
-          <w:lang w:val="de-DE" w:eastAsia="de-DE"/>
-        </w:rPr>
-        <w:t>version</w:t>
-      </w:r>
-      <w:proofErr w:type="spellEnd"/>
-      <w:r>
-        <w:rPr>
-          <w:rFonts w:ascii="Consolas" w:eastAsia="Times New Roman" w:hAnsi="Consolas" w:cs="Times New Roman"/>
-          <w:color w:val="C9AE75"/>
-          <w:lang w:val="de-DE" w:eastAsia="de-DE"/>
-        </w:rPr>
-        <w:t>&gt;.</w:t>
-      </w:r>
-      <w:proofErr w:type="spellStart"/>
-      <w:r>
-        <w:rPr>
-          <w:rFonts w:ascii="Consolas" w:eastAsia="Times New Roman" w:hAnsi="Consolas" w:cs="Times New Roman"/>
-          <w:color w:val="C9AE75"/>
-          <w:lang w:val="de-DE" w:eastAsia="de-DE"/>
-        </w:rPr>
-        <w:t>jar</w:t>
-      </w:r>
-      <w:proofErr w:type="spellEnd"/>
-      <w:r>
-        <w:rPr>
-          <w:rFonts w:ascii="SegoeUI" w:eastAsia="Times New Roman" w:hAnsi="SegoeUI" w:cs="Times New Roman"/>
-          <w:color w:val="000000"/>
-          <w:lang w:val="de-DE" w:eastAsia="de-DE"/>
-        </w:rPr>
-        <w:t xml:space="preserve">. In diesem Fall unter </w:t>
-      </w:r>
-      <w:proofErr w:type="spellStart"/>
-      <w:r>
-        <w:rPr>
-          <w:rFonts w:ascii="Consolas" w:eastAsia="Times New Roman" w:hAnsi="Consolas" w:cs="Times New Roman"/>
-          <w:color w:val="C9AE75"/>
-          <w:lang w:val="de-DE" w:eastAsia="de-DE"/>
-        </w:rPr>
-        <w:t>build</w:t>
-      </w:r>
-      <w:proofErr w:type="spellEnd"/>
-      <w:r>
-        <w:rPr>
-          <w:rFonts w:ascii="Consolas" w:eastAsia="Times New Roman" w:hAnsi="Consolas" w:cs="Times New Roman"/>
-          <w:color w:val="C9AE75"/>
-          <w:lang w:val="de-DE" w:eastAsia="de-DE"/>
-        </w:rPr>
-        <w:t>/</w:t>
-      </w:r>
-      <w:proofErr w:type="spellStart"/>
-      <w:r>
-        <w:rPr>
-          <w:rFonts w:ascii="Consolas" w:eastAsia="Times New Roman" w:hAnsi="Consolas" w:cs="Times New Roman"/>
-          <w:color w:val="C9AE75"/>
-          <w:lang w:val="de-DE" w:eastAsia="de-DE"/>
-        </w:rPr>
-        <w:t>libs</w:t>
-      </w:r>
-      <w:proofErr w:type="spellEnd"/>
-      <w:r>
-        <w:rPr>
-          <w:rFonts w:ascii="Consolas" w:eastAsia="Times New Roman" w:hAnsi="Consolas" w:cs="Times New Roman"/>
-          <w:color w:val="C9AE75"/>
-          <w:lang w:val="de-DE" w:eastAsia="de-DE"/>
-        </w:rPr>
-        <w:t>/Hadoopwordcount-1.0.jar</w:t>
+        <w:t>build/libs/Hadoopwordcount-1.0.jar</w:t>
       </w:r>
     </w:p>
     <w:p>
@@ -3494,60 +2589,12 @@
         </w:numPr>
       </w:pPr>
       <w:r>
-        <w:t xml:space="preserve">Prüfung des erstellten </w:t>
-      </w:r>
-      <w:proofErr w:type="spellStart"/>
-      <w:r>
-        <w:t>Artifacts</w:t>
-      </w:r>
-      <w:proofErr w:type="spellEnd"/>
-      <w:r>
-        <w:t xml:space="preserve"> und Kopieren auf Zielplattform</w:t>
-      </w:r>
-    </w:p>
-    <w:p>
-      <w:r>
-        <w:t xml:space="preserve">Je nach verwendetem </w:t>
-      </w:r>
-      <w:proofErr w:type="spellStart"/>
-      <w:r>
-        <w:t>Buildsystem</w:t>
-      </w:r>
-      <w:proofErr w:type="spellEnd"/>
-      <w:r>
-        <w:t xml:space="preserve"> und deren Settings findet man das generierte Jar-File unter z.B. out/</w:t>
-      </w:r>
-      <w:proofErr w:type="spellStart"/>
-      <w:r>
-        <w:t>artifacts</w:t>
-      </w:r>
-      <w:proofErr w:type="spellEnd"/>
-      <w:r>
-        <w:t xml:space="preserve"> oder </w:t>
-      </w:r>
-      <w:proofErr w:type="spellStart"/>
-      <w:r>
-        <w:t>build</w:t>
-      </w:r>
-      <w:proofErr w:type="spellEnd"/>
-      <w:r>
-        <w:t>/</w:t>
-      </w:r>
-      <w:proofErr w:type="spellStart"/>
-      <w:r>
-        <w:t>libs</w:t>
-      </w:r>
-      <w:proofErr w:type="spellEnd"/>
-      <w:r>
-        <w:t xml:space="preserve"> und beinhaltet der Dateiname eine </w:t>
-      </w:r>
-      <w:proofErr w:type="spellStart"/>
-      <w:r>
-        <w:t>Versionsnr</w:t>
-      </w:r>
-      <w:proofErr w:type="spellEnd"/>
-      <w:r>
-        <w:t>. oder nicht.</w:t>
+        <w:t>Prüfung des erstellten Artifacts und Kopieren auf Zielplattform</w:t>
+      </w:r>
+    </w:p>
+    <w:p>
+      <w:r>
+        <w:t>Je nach verwendetem Buildsystem und deren Settings findet man das generierte Jar-File unter z.B. out/artifacts oder build/libs und beinhaltet der Dateiname eine Versionsnr. oder nicht.</w:t>
       </w:r>
     </w:p>
     <w:p>
@@ -3560,92 +2607,23 @@
     </w:p>
     <w:p>
       <w:r>
-        <w:t xml:space="preserve">Das </w:t>
-      </w:r>
-      <w:proofErr w:type="spellStart"/>
-      <w:r>
-        <w:t>build.gradle</w:t>
-      </w:r>
-      <w:proofErr w:type="spellEnd"/>
-      <w:r>
-        <w:t xml:space="preserve"> beinhaltet einen „deploy“ Task, dieser funktioniert jedoch nur bei Passwort-</w:t>
-      </w:r>
-      <w:proofErr w:type="spellStart"/>
-      <w:r>
-        <w:t>based</w:t>
-      </w:r>
-      <w:proofErr w:type="spellEnd"/>
-      <w:r>
-        <w:t xml:space="preserve"> </w:t>
-      </w:r>
-      <w:proofErr w:type="spellStart"/>
-      <w:r>
-        <w:t>login</w:t>
-      </w:r>
-      <w:proofErr w:type="spellEnd"/>
-      <w:r>
-        <w:t xml:space="preserve"> bzw. müsste man die </w:t>
-      </w:r>
-      <w:proofErr w:type="spellStart"/>
-      <w:r>
-        <w:t>Credentials</w:t>
-      </w:r>
-      <w:proofErr w:type="spellEnd"/>
-      <w:r>
-        <w:t xml:space="preserve"> und Hostnamen ändern.</w:t>
-      </w:r>
-    </w:p>
-    <w:p>
-      <w:r>
-        <w:t xml:space="preserve">Daher am besten händisch die Datei manuell kopieren als </w:t>
-      </w:r>
-      <w:proofErr w:type="spellStart"/>
-      <w:r>
-        <w:t>user</w:t>
-      </w:r>
-      <w:proofErr w:type="spellEnd"/>
-      <w:r>
-        <w:t xml:space="preserve"> „</w:t>
-      </w:r>
-      <w:proofErr w:type="spellStart"/>
-      <w:r>
-        <w:t>student</w:t>
-      </w:r>
-      <w:proofErr w:type="spellEnd"/>
-      <w:r>
-        <w:t xml:space="preserve">“ und dann die Datei dem </w:t>
-      </w:r>
-      <w:proofErr w:type="spellStart"/>
-      <w:r>
-        <w:t>hduser</w:t>
-      </w:r>
-      <w:proofErr w:type="spellEnd"/>
-      <w:r>
-        <w:t xml:space="preserve"> „schenken“:</w:t>
+        <w:t>Das build.gradle beinhaltet einen „deploy“ Task, dieser funktioniert jedoch nur bei Passwort-based login bzw. müsste man die Credentials und Hostnamen ändern.</w:t>
+      </w:r>
+    </w:p>
+    <w:p>
+      <w:r>
+        <w:t>Daher am besten händisch die Datei manuell kopieren als user „student“ und dann die Datei dem hduser „schenken“:</w:t>
       </w:r>
     </w:p>
     <w:p>
       <w:pPr>
         <w:pStyle w:val="Source"/>
       </w:pPr>
-      <w:proofErr w:type="spellStart"/>
-      <w:r>
-        <w:t>scp</w:t>
-      </w:r>
-      <w:proofErr w:type="spellEnd"/>
-      <w:r>
-        <w:t xml:space="preserve"> </w:t>
-      </w:r>
-      <w:r>
-        <w:t>-I &lt;</w:t>
-      </w:r>
-      <w:proofErr w:type="spellStart"/>
-      <w:r>
-        <w:t>PrivateKeyFile</w:t>
-      </w:r>
-      <w:proofErr w:type="spellEnd"/>
-      <w:r>
-        <w:t xml:space="preserve">&gt; </w:t>
+      <w:r>
+        <w:t xml:space="preserve">scp </w:t>
+      </w:r>
+      <w:r>
+        <w:t xml:space="preserve">-I &lt;PrivateKeyFile&gt; </w:t>
       </w:r>
       <w:r>
         <w:t>Hadoopwordcount-1.0</w:t>
@@ -3674,40 +2652,11 @@
       <w:pPr>
         <w:pStyle w:val="Source"/>
       </w:pPr>
-      <w:proofErr w:type="spellStart"/>
-      <w:r>
-        <w:t>sudo</w:t>
-      </w:r>
-      <w:proofErr w:type="spellEnd"/>
-      <w:r>
-        <w:t xml:space="preserve"> </w:t>
-      </w:r>
-      <w:proofErr w:type="spellStart"/>
-      <w:r>
-        <w:t>chown</w:t>
-      </w:r>
-      <w:proofErr w:type="spellEnd"/>
-      <w:r>
-        <w:t xml:space="preserve"> </w:t>
-      </w:r>
-      <w:proofErr w:type="spellStart"/>
-      <w:r>
-        <w:t>hduser:hadoop</w:t>
-      </w:r>
-      <w:proofErr w:type="spellEnd"/>
-      <w:r>
-        <w:t xml:space="preserve"> /</w:t>
-      </w:r>
-      <w:proofErr w:type="spellStart"/>
-      <w:r>
-        <w:t>t</w:t>
-      </w:r>
-      <w:r>
-        <w:t>mp</w:t>
-      </w:r>
-      <w:proofErr w:type="spellEnd"/>
-      <w:r>
-        <w:t>/</w:t>
+      <w:r>
+        <w:t>sudo chown hduser:hadoop /t</w:t>
+      </w:r>
+      <w:r>
+        <w:t>mp/</w:t>
       </w:r>
       <w:r>
         <w:t>Hadoopwordcount-1.0.jar</w:t>
@@ -3717,34 +2666,16 @@
       <w:pPr>
         <w:pStyle w:val="Source"/>
       </w:pPr>
-      <w:proofErr w:type="spellStart"/>
-      <w:r>
-        <w:t>su</w:t>
-      </w:r>
-      <w:proofErr w:type="spellEnd"/>
-      <w:r>
-        <w:t xml:space="preserve"> – </w:t>
-      </w:r>
-      <w:proofErr w:type="spellStart"/>
-      <w:r>
-        <w:t>hduser</w:t>
-      </w:r>
-      <w:proofErr w:type="spellEnd"/>
+      <w:r>
+        <w:t>su – hduser</w:t>
+      </w:r>
     </w:p>
     <w:p>
       <w:pPr>
         <w:pStyle w:val="Source"/>
       </w:pPr>
       <w:r>
-        <w:t>mv /</w:t>
-      </w:r>
-      <w:proofErr w:type="spellStart"/>
-      <w:r>
-        <w:t>tmp</w:t>
-      </w:r>
-      <w:proofErr w:type="spellEnd"/>
-      <w:r>
-        <w:t>/Hadoopwordcount-1.0.jar ~/Hadoopwordcount.jar</w:t>
+        <w:t>mv /tmp/Hadoopwordcount-1.0.jar ~/Hadoopwordcount.jar</w:t>
       </w:r>
     </w:p>
     <w:p>
@@ -3767,21 +2698,7 @@
         <w:rPr>
           <w:lang w:val="de-DE"/>
         </w:rPr>
-        <w:t xml:space="preserve">Test des generierten </w:t>
-      </w:r>
-      <w:proofErr w:type="spellStart"/>
-      <w:r>
-        <w:rPr>
-          <w:lang w:val="de-DE"/>
-        </w:rPr>
-        <w:t>jar</w:t>
-      </w:r>
-      <w:proofErr w:type="spellEnd"/>
-      <w:r>
-        <w:rPr>
-          <w:lang w:val="de-DE"/>
-        </w:rPr>
-        <w:t>-Files</w:t>
+        <w:t>Test des generierten jar-Files</w:t>
       </w:r>
     </w:p>
     <w:p>
@@ -3803,15 +2720,7 @@
         </w:numPr>
       </w:pPr>
       <w:r>
-        <w:t xml:space="preserve">Input Ordner und Beispiel Textdatei im </w:t>
-      </w:r>
-      <w:proofErr w:type="spellStart"/>
-      <w:r>
-        <w:t>hdfs</w:t>
-      </w:r>
-      <w:proofErr w:type="spellEnd"/>
-      <w:r>
-        <w:t xml:space="preserve"> anlegen</w:t>
+        <w:t>Input Ordner und Beispiel Textdatei im hdfs anlegen</w:t>
       </w:r>
     </w:p>
     <w:p>
@@ -3830,20 +2739,10 @@
       <w:pPr>
         <w:pStyle w:val="Source"/>
       </w:pPr>
-      <w:proofErr w:type="spellStart"/>
       <w:r>
         <w:lastRenderedPageBreak/>
-        <w:t>su</w:t>
-      </w:r>
-      <w:proofErr w:type="spellEnd"/>
-      <w:r>
-        <w:t xml:space="preserve"> – </w:t>
-      </w:r>
-      <w:proofErr w:type="spellStart"/>
-      <w:r>
-        <w:t>hduser</w:t>
-      </w:r>
-      <w:proofErr w:type="spellEnd"/>
+        <w:t>su – hduser</w:t>
+      </w:r>
     </w:p>
     <w:p>
       <w:pPr>
@@ -3858,106 +2757,49 @@
         <w:pStyle w:val="Source"/>
       </w:pPr>
       <w:r>
-        <w:t>start-yarn.sh</w:t>
+        <w:t>hdfs dfs -mkdir /input</w:t>
       </w:r>
     </w:p>
     <w:p>
       <w:pPr>
         <w:pStyle w:val="Source"/>
       </w:pPr>
-      <w:proofErr w:type="spellStart"/>
-      <w:r>
-        <w:t>hdfs</w:t>
-      </w:r>
-      <w:proofErr w:type="spellEnd"/>
-      <w:r>
-        <w:t xml:space="preserve"> </w:t>
-      </w:r>
-      <w:proofErr w:type="spellStart"/>
-      <w:r>
-        <w:t>dfs</w:t>
-      </w:r>
-      <w:proofErr w:type="spellEnd"/>
-      <w:r>
-        <w:t xml:space="preserve"> -</w:t>
-      </w:r>
-      <w:proofErr w:type="spellStart"/>
-      <w:r>
-        <w:t>mkdir</w:t>
-      </w:r>
-      <w:proofErr w:type="spellEnd"/>
-      <w:r>
-        <w:t xml:space="preserve"> /input</w:t>
+      <w:r>
+        <w:t>hdfs dfs -mkdir /output</w:t>
       </w:r>
     </w:p>
     <w:p>
       <w:pPr>
         <w:pStyle w:val="Source"/>
       </w:pPr>
-      <w:proofErr w:type="spellStart"/>
-      <w:r>
-        <w:t>hdfs</w:t>
-      </w:r>
-      <w:proofErr w:type="spellEnd"/>
-      <w:r>
-        <w:t xml:space="preserve"> </w:t>
-      </w:r>
-      <w:proofErr w:type="spellStart"/>
-      <w:r>
-        <w:t>dfs</w:t>
-      </w:r>
-      <w:proofErr w:type="spellEnd"/>
-      <w:r>
-        <w:t xml:space="preserve"> -</w:t>
-      </w:r>
-      <w:proofErr w:type="spellStart"/>
-      <w:r>
-        <w:t>mkdir</w:t>
-      </w:r>
-      <w:proofErr w:type="spellEnd"/>
-      <w:r>
-        <w:t xml:space="preserve"> /output</w:t>
+      <w:r>
+        <w:t xml:space="preserve">hdfs dfs -put </w:t>
+      </w:r>
+      <w:r>
+        <w:t>~/BigData/data</w:t>
+      </w:r>
+      <w:r>
+        <w:t>/</w:t>
+      </w:r>
+      <w:r>
+        <w:t>Bibel.txt</w:t>
+      </w:r>
+      <w:r>
+        <w:t xml:space="preserve"> /input/</w:t>
       </w:r>
     </w:p>
     <w:p>
       <w:pPr>
         <w:pStyle w:val="Source"/>
-      </w:pPr>
-      <w:proofErr w:type="spellStart"/>
-      <w:r>
-        <w:t>hdfs</w:t>
-      </w:r>
-      <w:proofErr w:type="spellEnd"/>
-      <w:r>
-        <w:t xml:space="preserve"> </w:t>
-      </w:r>
-      <w:proofErr w:type="spellStart"/>
-      <w:r>
-        <w:t>dfs</w:t>
-      </w:r>
-      <w:proofErr w:type="spellEnd"/>
-      <w:r>
-        <w:t xml:space="preserve"> -put </w:t>
-      </w:r>
-      <w:r>
-        <w:t>~/</w:t>
-      </w:r>
-      <w:proofErr w:type="spellStart"/>
-      <w:r>
-        <w:t>BigData</w:t>
-      </w:r>
-      <w:proofErr w:type="spellEnd"/>
-      <w:r>
-        <w:t>/data</w:t>
-      </w:r>
-      <w:r>
-        <w:t>/</w:t>
-      </w:r>
-      <w:r>
-        <w:t>Bibel.txt</w:t>
-      </w:r>
-      <w:r>
-        <w:t xml:space="preserve"> /input/</w:t>
+        <w:rPr>
+          <w:lang w:val="de-DE"/>
+        </w:rPr>
+      </w:pPr>
+      <w:r>
+        <w:rPr>
+          <w:lang w:val="de-DE"/>
+        </w:rPr>
+        <w:t>OutputDir=/output/Bibel</w:t>
       </w:r>
     </w:p>
     <w:p>
@@ -3967,33 +2809,17 @@
           <w:lang w:val="de-DE"/>
         </w:rPr>
       </w:pPr>
-      <w:proofErr w:type="spellStart"/>
-      <w:r>
-        <w:rPr>
-          <w:lang w:val="de-DE"/>
-        </w:rPr>
-        <w:t>OutputDir</w:t>
-      </w:r>
-      <w:proofErr w:type="spellEnd"/>
-      <w:r>
-        <w:rPr>
-          <w:lang w:val="de-DE"/>
-        </w:rPr>
-        <w:t>=/</w:t>
-      </w:r>
-      <w:proofErr w:type="spellStart"/>
-      <w:r>
-        <w:rPr>
-          <w:lang w:val="de-DE"/>
-        </w:rPr>
-        <w:t>output</w:t>
-      </w:r>
-      <w:proofErr w:type="spellEnd"/>
-      <w:r>
-        <w:rPr>
-          <w:lang w:val="de-DE"/>
-        </w:rPr>
-        <w:t>/Bibel</w:t>
+      <w:r>
+        <w:rPr>
+          <w:lang w:val="de-DE"/>
+        </w:rPr>
+        <w:t># folgendes für jeden Versuch n</w:t>
+      </w:r>
+      <w:r>
+        <w:rPr>
+          <w:lang w:val="de-DE"/>
+        </w:rPr>
+        <w:t>eu ausführen</w:t>
       </w:r>
     </w:p>
     <w:p>
@@ -4007,13 +2833,19 @@
         <w:rPr>
           <w:lang w:val="de-DE"/>
         </w:rPr>
-        <w:t># folgendes für jeden Versuch n</w:t>
-      </w:r>
-      <w:r>
-        <w:rPr>
-          <w:lang w:val="de-DE"/>
-        </w:rPr>
-        <w:t>eu ausführen</w:t>
+        <w:t xml:space="preserve">hdfs dfs </w:t>
+      </w:r>
+      <w:r>
+        <w:rPr>
+          <w:lang w:val="de-DE"/>
+        </w:rPr>
+        <w:t>-</w:t>
+      </w:r>
+      <w:r>
+        <w:rPr>
+          <w:lang w:val="de-DE"/>
+        </w:rPr>
+        <w:t>rm -R $OutputDir</w:t>
       </w:r>
     </w:p>
     <w:p>
@@ -4023,62 +2855,36 @@
           <w:lang w:val="de-DE"/>
         </w:rPr>
       </w:pPr>
-      <w:proofErr w:type="spellStart"/>
-      <w:r>
-        <w:rPr>
-          <w:lang w:val="de-DE"/>
-        </w:rPr>
-        <w:t>hdfs</w:t>
-      </w:r>
-      <w:proofErr w:type="spellEnd"/>
-      <w:r>
-        <w:rPr>
-          <w:lang w:val="de-DE"/>
-        </w:rPr>
-        <w:t xml:space="preserve"> </w:t>
-      </w:r>
-      <w:proofErr w:type="spellStart"/>
-      <w:r>
-        <w:rPr>
-          <w:lang w:val="de-DE"/>
-        </w:rPr>
-        <w:t>dfs</w:t>
-      </w:r>
-      <w:proofErr w:type="spellEnd"/>
-      <w:r>
-        <w:rPr>
-          <w:lang w:val="de-DE"/>
-        </w:rPr>
-        <w:t xml:space="preserve"> </w:t>
-      </w:r>
-      <w:r>
-        <w:rPr>
-          <w:lang w:val="de-DE"/>
-        </w:rPr>
-        <w:t>-</w:t>
-      </w:r>
-      <w:proofErr w:type="spellStart"/>
-      <w:r>
-        <w:rPr>
-          <w:lang w:val="de-DE"/>
-        </w:rPr>
-        <w:t>rm</w:t>
-      </w:r>
-      <w:proofErr w:type="spellEnd"/>
-      <w:r>
-        <w:rPr>
-          <w:lang w:val="de-DE"/>
-        </w:rPr>
-        <w:t xml:space="preserve"> -R $</w:t>
-      </w:r>
-      <w:proofErr w:type="spellStart"/>
-      <w:r>
-        <w:rPr>
-          <w:lang w:val="de-DE"/>
-        </w:rPr>
-        <w:t>OutputDir</w:t>
-      </w:r>
-      <w:proofErr w:type="spellEnd"/>
+      <w:r>
+        <w:rPr>
+          <w:lang w:val="de-DE"/>
+        </w:rPr>
+        <w:t xml:space="preserve">hadoop jar </w:t>
+      </w:r>
+      <w:r>
+        <w:rPr>
+          <w:lang w:val="de-AT"/>
+        </w:rPr>
+        <w:t>Hadoop</w:t>
+      </w:r>
+      <w:r>
+        <w:rPr>
+          <w:lang w:val="de-AT"/>
+        </w:rPr>
+        <w:t>wordc</w:t>
+      </w:r>
+      <w:r>
+        <w:rPr>
+          <w:lang w:val="de-AT"/>
+        </w:rPr>
+        <w:t>ount</w:t>
+      </w:r>
+      <w:r>
+        <w:rPr>
+          <w:lang w:val="de-DE"/>
+        </w:rPr>
+        <w:t>.jar /input/Bibel.txt $OutputDir</w:t>
+      </w:r>
     </w:p>
     <w:p>
       <w:pPr>
@@ -4087,39 +2893,120 @@
           <w:lang w:val="de-DE"/>
         </w:rPr>
       </w:pPr>
-      <w:proofErr w:type="spellStart"/>
-      <w:r>
-        <w:rPr>
-          <w:lang w:val="de-DE"/>
-        </w:rPr>
-        <w:t>hadoop</w:t>
-      </w:r>
-      <w:proofErr w:type="spellEnd"/>
-      <w:r>
-        <w:rPr>
-          <w:lang w:val="de-DE"/>
-        </w:rPr>
-        <w:t xml:space="preserve"> </w:t>
-      </w:r>
-      <w:proofErr w:type="spellStart"/>
-      <w:r>
-        <w:rPr>
-          <w:lang w:val="de-DE"/>
-        </w:rPr>
-        <w:t>jar</w:t>
-      </w:r>
-      <w:proofErr w:type="spellEnd"/>
-      <w:r>
-        <w:rPr>
-          <w:lang w:val="de-DE"/>
-        </w:rPr>
-        <w:t xml:space="preserve"> </w:t>
-      </w:r>
-      <w:proofErr w:type="spellStart"/>
-      <w:r>
+    </w:p>
+    <w:p>
+      <w:r>
+        <w:t xml:space="preserve">Bei Problemen (vor allem wenn Meldung „main class not found“) die Jar-Datei überprüfen ("jar -tvf" funktioniert </w:t>
+      </w:r>
+      <w:r>
+        <w:t xml:space="preserve">unter Linux </w:t>
+      </w:r>
+      <w:r>
+        <w:t>als auch Windows</w:t>
+      </w:r>
+      <w:r>
+        <w:t>), sie muss zumindest folgende 4 Dateien beinhalten:</w:t>
+      </w:r>
+    </w:p>
+    <w:p>
+      <w:pPr>
+        <w:pStyle w:val="Source"/>
         <w:rPr>
           <w:lang w:val="de-AT"/>
         </w:rPr>
+      </w:pPr>
+      <w:r>
+        <w:rPr>
+          <w:lang w:val="de-AT"/>
+        </w:rPr>
+        <w:t>j</w:t>
+      </w:r>
+      <w:r>
+        <w:rPr>
+          <w:lang w:val="de-AT"/>
+        </w:rPr>
+        <w:t>ar -tvf Hadoop</w:t>
+      </w:r>
+      <w:r>
+        <w:rPr>
+          <w:lang w:val="de-AT"/>
+        </w:rPr>
+        <w:t>wordc</w:t>
+      </w:r>
+      <w:r>
+        <w:rPr>
+          <w:lang w:val="de-AT"/>
+        </w:rPr>
+        <w:t>ount.jar | awk '{ print $8 }'</w:t>
+      </w:r>
+    </w:p>
+    <w:p>
+      <w:pPr>
+        <w:pStyle w:val="Source"/>
+      </w:pPr>
+      <w:r>
+        <w:t>META-INF/MANIFEST.MF</w:t>
+      </w:r>
+    </w:p>
+    <w:p>
+      <w:pPr>
+        <w:pStyle w:val="Source"/>
+      </w:pPr>
+      <w:r>
+        <w:t>at/fhj/MapClass.class</w:t>
+      </w:r>
+    </w:p>
+    <w:p>
+      <w:pPr>
+        <w:pStyle w:val="Source"/>
+      </w:pPr>
+      <w:r>
+        <w:t>at/fhj/ReduceClass.class</w:t>
+      </w:r>
+    </w:p>
+    <w:p>
+      <w:pPr>
+        <w:pStyle w:val="Source"/>
+        <w:rPr>
+          <w:lang w:val="de-DE"/>
+        </w:rPr>
+      </w:pPr>
+      <w:r>
+        <w:rPr>
+          <w:lang w:val="de-DE"/>
+        </w:rPr>
+        <w:t>at/fhj/WordCount.class</w:t>
+      </w:r>
+    </w:p>
+    <w:p>
+      <w:pPr>
+        <w:rPr>
+          <w:lang w:val="de-DE"/>
+        </w:rPr>
+      </w:pPr>
+    </w:p>
+    <w:p>
+      <w:r>
+        <w:t>Der Inhalt der Datei MANIFEST.MF sollte wie folgt sein (optional stehen dahinter noch ClassPaths):</w:t>
+      </w:r>
+    </w:p>
+    <w:p>
+      <w:pPr>
+        <w:pStyle w:val="Source"/>
+        <w:rPr>
+          <w:lang w:val="de-AT"/>
+        </w:rPr>
+      </w:pPr>
+      <w:r>
+        <w:rPr>
+          <w:lang w:val="de-AT"/>
+        </w:rPr>
+        <w:t xml:space="preserve">jar -xf </w:t>
+      </w:r>
+      <w:r>
+        <w:rPr>
+          <w:lang w:val="de-AT"/>
+        </w:rPr>
         <w:t>Hadoop</w:t>
       </w:r>
       <w:r>
@@ -4134,371 +3021,25 @@
         </w:rPr>
         <w:t>ount</w:t>
       </w:r>
-      <w:proofErr w:type="spellEnd"/>
-      <w:r>
-        <w:rPr>
-          <w:lang w:val="de-DE"/>
-        </w:rPr>
-        <w:t>.</w:t>
-      </w:r>
-      <w:proofErr w:type="spellStart"/>
-      <w:r>
-        <w:rPr>
-          <w:lang w:val="de-DE"/>
-        </w:rPr>
-        <w:t>jar</w:t>
-      </w:r>
-      <w:proofErr w:type="spellEnd"/>
-      <w:r>
-        <w:rPr>
-          <w:lang w:val="de-DE"/>
-        </w:rPr>
-        <w:t xml:space="preserve"> /</w:t>
-      </w:r>
-      <w:proofErr w:type="spellStart"/>
-      <w:r>
-        <w:rPr>
-          <w:lang w:val="de-DE"/>
-        </w:rPr>
-        <w:t>input</w:t>
-      </w:r>
-      <w:proofErr w:type="spellEnd"/>
-      <w:r>
-        <w:rPr>
-          <w:lang w:val="de-DE"/>
-        </w:rPr>
-        <w:t>/Bibel.txt $</w:t>
-      </w:r>
-      <w:proofErr w:type="spellStart"/>
-      <w:r>
-        <w:rPr>
-          <w:lang w:val="de-DE"/>
-        </w:rPr>
-        <w:t>OutputDir</w:t>
-      </w:r>
-      <w:proofErr w:type="spellEnd"/>
+      <w:r>
+        <w:rPr>
+          <w:lang w:val="de-AT"/>
+        </w:rPr>
+        <w:t>.jar META-INF/MANIFEST.MF</w:t>
+      </w:r>
     </w:p>
     <w:p>
       <w:pPr>
         <w:pStyle w:val="Source"/>
         <w:rPr>
-          <w:lang w:val="de-DE"/>
-        </w:rPr>
-      </w:pPr>
-    </w:p>
-    <w:p>
-      <w:r>
-        <w:t>Bei Problemen (vor allem wenn Meldung „</w:t>
-      </w:r>
-      <w:proofErr w:type="spellStart"/>
-      <w:r>
-        <w:t>main</w:t>
-      </w:r>
-      <w:proofErr w:type="spellEnd"/>
-      <w:r>
-        <w:t xml:space="preserve"> </w:t>
-      </w:r>
-      <w:proofErr w:type="spellStart"/>
-      <w:r>
-        <w:t>class</w:t>
-      </w:r>
-      <w:proofErr w:type="spellEnd"/>
-      <w:r>
-        <w:t xml:space="preserve"> not </w:t>
-      </w:r>
-      <w:proofErr w:type="spellStart"/>
-      <w:r>
-        <w:t>found</w:t>
-      </w:r>
-      <w:proofErr w:type="spellEnd"/>
-      <w:r>
-        <w:t>“) die Jar-Datei überprüfen ("</w:t>
-      </w:r>
-      <w:proofErr w:type="spellStart"/>
-      <w:r>
-        <w:t>jar</w:t>
-      </w:r>
-      <w:proofErr w:type="spellEnd"/>
-      <w:r>
-        <w:t xml:space="preserve"> -</w:t>
-      </w:r>
-      <w:proofErr w:type="spellStart"/>
-      <w:r>
-        <w:t>tvf</w:t>
-      </w:r>
-      <w:proofErr w:type="spellEnd"/>
-      <w:r>
-        <w:t>" funktioniert meines Wissens nur unter Linux), sie muss zumindest folgende 4 Dateien beinhalten:</w:t>
-      </w:r>
-    </w:p>
-    <w:p>
-      <w:pPr>
-        <w:pStyle w:val="Source"/>
-        <w:rPr>
           <w:lang w:val="de-AT"/>
         </w:rPr>
       </w:pPr>
-      <w:proofErr w:type="spellStart"/>
       <w:r>
         <w:rPr>
           <w:lang w:val="de-AT"/>
         </w:rPr>
-        <w:t>j</w:t>
-      </w:r>
-      <w:r>
-        <w:rPr>
-          <w:lang w:val="de-AT"/>
-        </w:rPr>
-        <w:t>ar</w:t>
-      </w:r>
-      <w:proofErr w:type="spellEnd"/>
-      <w:r>
-        <w:rPr>
-          <w:lang w:val="de-AT"/>
-        </w:rPr>
-        <w:t xml:space="preserve"> -</w:t>
-      </w:r>
-      <w:proofErr w:type="spellStart"/>
-      <w:r>
-        <w:rPr>
-          <w:lang w:val="de-AT"/>
-        </w:rPr>
-        <w:t>tvf</w:t>
-      </w:r>
-      <w:proofErr w:type="spellEnd"/>
-      <w:r>
-        <w:rPr>
-          <w:lang w:val="de-AT"/>
-        </w:rPr>
-        <w:t xml:space="preserve"> Hadoop</w:t>
-      </w:r>
-      <w:r>
-        <w:rPr>
-          <w:lang w:val="de-AT"/>
-        </w:rPr>
-        <w:t>wordc</w:t>
-      </w:r>
-      <w:r>
-        <w:rPr>
-          <w:lang w:val="de-AT"/>
-        </w:rPr>
-        <w:t xml:space="preserve">ount.jar | </w:t>
-      </w:r>
-      <w:proofErr w:type="spellStart"/>
-      <w:r>
-        <w:rPr>
-          <w:lang w:val="de-AT"/>
-        </w:rPr>
-        <w:t>awk</w:t>
-      </w:r>
-      <w:proofErr w:type="spellEnd"/>
-      <w:r>
-        <w:rPr>
-          <w:lang w:val="de-AT"/>
-        </w:rPr>
-        <w:t xml:space="preserve"> '{ </w:t>
-      </w:r>
-      <w:proofErr w:type="spellStart"/>
-      <w:r>
-        <w:rPr>
-          <w:lang w:val="de-AT"/>
-        </w:rPr>
-        <w:t>print</w:t>
-      </w:r>
-      <w:proofErr w:type="spellEnd"/>
-      <w:r>
-        <w:rPr>
-          <w:lang w:val="de-AT"/>
-        </w:rPr>
-        <w:t xml:space="preserve"> $8 }'</w:t>
-      </w:r>
-    </w:p>
-    <w:p>
-      <w:pPr>
-        <w:pStyle w:val="Source"/>
-      </w:pPr>
-      <w:r>
-        <w:t>META-INF/MANIFEST.MF</w:t>
-      </w:r>
-    </w:p>
-    <w:p>
-      <w:pPr>
-        <w:pStyle w:val="Source"/>
-      </w:pPr>
-      <w:r>
-        <w:t>at/</w:t>
-      </w:r>
-      <w:proofErr w:type="spellStart"/>
-      <w:r>
-        <w:t>fhj</w:t>
-      </w:r>
-      <w:proofErr w:type="spellEnd"/>
-      <w:r>
-        <w:t>/</w:t>
-      </w:r>
-      <w:proofErr w:type="spellStart"/>
-      <w:r>
-        <w:t>MapClass.class</w:t>
-      </w:r>
-      <w:proofErr w:type="spellEnd"/>
-    </w:p>
-    <w:p>
-      <w:pPr>
-        <w:pStyle w:val="Source"/>
-      </w:pPr>
-      <w:r>
-        <w:t>at/</w:t>
-      </w:r>
-      <w:proofErr w:type="spellStart"/>
-      <w:r>
-        <w:t>fhj</w:t>
-      </w:r>
-      <w:proofErr w:type="spellEnd"/>
-      <w:r>
-        <w:t>/</w:t>
-      </w:r>
-      <w:proofErr w:type="spellStart"/>
-      <w:r>
-        <w:t>ReduceClass.class</w:t>
-      </w:r>
-      <w:proofErr w:type="spellEnd"/>
-    </w:p>
-    <w:p>
-      <w:pPr>
-        <w:pStyle w:val="Source"/>
-        <w:rPr>
-          <w:lang w:val="de-DE"/>
-        </w:rPr>
-      </w:pPr>
-      <w:r>
-        <w:rPr>
-          <w:lang w:val="de-DE"/>
-        </w:rPr>
-        <w:t>at/</w:t>
-      </w:r>
-      <w:proofErr w:type="spellStart"/>
-      <w:r>
-        <w:rPr>
-          <w:lang w:val="de-DE"/>
-        </w:rPr>
-        <w:t>fhj</w:t>
-      </w:r>
-      <w:proofErr w:type="spellEnd"/>
-      <w:r>
-        <w:rPr>
-          <w:lang w:val="de-DE"/>
-        </w:rPr>
-        <w:t>/</w:t>
-      </w:r>
-      <w:proofErr w:type="spellStart"/>
-      <w:r>
-        <w:rPr>
-          <w:lang w:val="de-DE"/>
-        </w:rPr>
-        <w:t>WordCount.class</w:t>
-      </w:r>
-      <w:proofErr w:type="spellEnd"/>
-    </w:p>
-    <w:p>
-      <w:pPr>
-        <w:rPr>
-          <w:lang w:val="de-DE"/>
-        </w:rPr>
-      </w:pPr>
-    </w:p>
-    <w:p>
-      <w:r>
-        <w:t xml:space="preserve">Der Inhalt der Datei MANIFEST.MF sollte wie folgt sein (optional stehen dahinter noch </w:t>
-      </w:r>
-      <w:proofErr w:type="spellStart"/>
-      <w:r>
-        <w:t>ClassPaths</w:t>
-      </w:r>
-      <w:proofErr w:type="spellEnd"/>
-      <w:r>
-        <w:t>):</w:t>
-      </w:r>
-    </w:p>
-    <w:p>
-      <w:pPr>
-        <w:pStyle w:val="Source"/>
-        <w:rPr>
-          <w:lang w:val="de-AT"/>
-        </w:rPr>
-      </w:pPr>
-      <w:proofErr w:type="spellStart"/>
-      <w:r>
-        <w:rPr>
-          <w:lang w:val="de-AT"/>
-        </w:rPr>
-        <w:t>jar</w:t>
-      </w:r>
-      <w:proofErr w:type="spellEnd"/>
-      <w:r>
-        <w:rPr>
-          <w:lang w:val="de-AT"/>
-        </w:rPr>
-        <w:t xml:space="preserve"> -</w:t>
-      </w:r>
-      <w:proofErr w:type="spellStart"/>
-      <w:r>
-        <w:rPr>
-          <w:lang w:val="de-AT"/>
-        </w:rPr>
-        <w:t>xf</w:t>
-      </w:r>
-      <w:proofErr w:type="spellEnd"/>
-      <w:r>
-        <w:rPr>
-          <w:lang w:val="de-AT"/>
-        </w:rPr>
-        <w:t xml:space="preserve"> </w:t>
-      </w:r>
-      <w:r>
-        <w:rPr>
-          <w:lang w:val="de-AT"/>
-        </w:rPr>
-        <w:t>Hadoop</w:t>
-      </w:r>
-      <w:r>
-        <w:rPr>
-          <w:lang w:val="de-AT"/>
-        </w:rPr>
-        <w:t>wordc</w:t>
-      </w:r>
-      <w:r>
-        <w:rPr>
-          <w:lang w:val="de-AT"/>
-        </w:rPr>
-        <w:t>ount</w:t>
-      </w:r>
-      <w:r>
-        <w:rPr>
-          <w:lang w:val="de-AT"/>
-        </w:rPr>
-        <w:t>.jar META-INF/MANIFEST.MF</w:t>
-      </w:r>
-    </w:p>
-    <w:p>
-      <w:pPr>
-        <w:pStyle w:val="Source"/>
-        <w:rPr>
-          <w:lang w:val="de-AT"/>
-        </w:rPr>
-      </w:pPr>
-      <w:proofErr w:type="spellStart"/>
-      <w:r>
-        <w:rPr>
-          <w:lang w:val="de-AT"/>
-        </w:rPr>
-        <w:t>cat</w:t>
-      </w:r>
-      <w:proofErr w:type="spellEnd"/>
-      <w:r>
-        <w:rPr>
-          <w:lang w:val="de-AT"/>
-        </w:rPr>
-        <w:t xml:space="preserve"> META-INF/MANIFEST.MF</w:t>
+        <w:t>cat META-INF/MANIFEST.MF</w:t>
       </w:r>
     </w:p>
     <w:p>
@@ -4534,18 +3075,8 @@
           <w:bCs/>
           <w:color w:val="0070C0"/>
         </w:rPr>
-        <w:t xml:space="preserve">Main-Class: </w:t>
-      </w:r>
-      <w:proofErr w:type="spellStart"/>
-      <w:r>
-        <w:rPr>
-          <w:b/>
-          <w:bCs/>
-          <w:color w:val="0070C0"/>
-        </w:rPr>
-        <w:t>at.fhj.WordCount</w:t>
-      </w:r>
-      <w:proofErr w:type="spellEnd"/>
+        <w:t>Main-Class: at.fhj.WordCount</w:t>
+      </w:r>
     </w:p>
     <w:p>
       <w:pPr>
@@ -4748,35 +3279,7 @@
         <w:rPr>
           <w:lang w:val="de-DE"/>
         </w:rPr>
-        <w:t xml:space="preserve">Das “Tail </w:t>
-      </w:r>
-      <w:proofErr w:type="spellStart"/>
-      <w:r>
-        <w:rPr>
-          <w:lang w:val="de-DE"/>
-        </w:rPr>
-        <w:t>the</w:t>
-      </w:r>
-      <w:proofErr w:type="spellEnd"/>
-      <w:r>
-        <w:rPr>
-          <w:lang w:val="de-DE"/>
-        </w:rPr>
-        <w:t xml:space="preserve"> </w:t>
-      </w:r>
-      <w:proofErr w:type="spellStart"/>
-      <w:r>
-        <w:rPr>
-          <w:lang w:val="de-DE"/>
-        </w:rPr>
-        <w:t>file</w:t>
-      </w:r>
-      <w:proofErr w:type="spellEnd"/>
-      <w:r>
-        <w:rPr>
-          <w:lang w:val="de-DE"/>
-        </w:rPr>
-        <w:t>” funktioniert übliche</w:t>
+        <w:t>Das “Tail the file” funktioniert übliche</w:t>
       </w:r>
       <w:r>
         <w:rPr>
@@ -4789,42 +3292,16 @@
       <w:pPr>
         <w:pStyle w:val="Source"/>
       </w:pPr>
-      <w:proofErr w:type="spellStart"/>
-      <w:r>
-        <w:t>hdfs</w:t>
-      </w:r>
-      <w:proofErr w:type="spellEnd"/>
-      <w:r>
-        <w:t xml:space="preserve"> </w:t>
-      </w:r>
-      <w:proofErr w:type="spellStart"/>
-      <w:r>
-        <w:t>dfs</w:t>
-      </w:r>
-      <w:proofErr w:type="spellEnd"/>
-      <w:r>
-        <w:t xml:space="preserve"> -tail /output/Bibel/part-r-00000</w:t>
+      <w:r>
+        <w:t>hdfs dfs -tail /output/Bibel/part-r-00000</w:t>
       </w:r>
     </w:p>
     <w:p>
       <w:pPr>
         <w:pStyle w:val="Source"/>
       </w:pPr>
-      <w:proofErr w:type="spellStart"/>
-      <w:r>
-        <w:t>hdfs</w:t>
-      </w:r>
-      <w:proofErr w:type="spellEnd"/>
-      <w:r>
-        <w:t xml:space="preserve"> </w:t>
-      </w:r>
-      <w:proofErr w:type="spellStart"/>
-      <w:r>
-        <w:t>dfs</w:t>
-      </w:r>
-      <w:proofErr w:type="spellEnd"/>
-      <w:r>
-        <w:t xml:space="preserve"> -</w:t>
+      <w:r>
+        <w:t>hdfs dfs -</w:t>
       </w:r>
       <w:r>
         <w:t>head</w:t>
@@ -4837,6 +3314,37 @@
       <w:pPr>
         <w:pStyle w:val="Source"/>
       </w:pPr>
+    </w:p>
+    <w:p>
+      <w:pPr>
+        <w:rPr>
+          <w:color w:val="FF0000"/>
+        </w:rPr>
+      </w:pPr>
+      <w:r>
+        <w:rPr>
+          <w:color w:val="FF0000"/>
+        </w:rPr>
+        <w:t>Wichtig: wenn der Job erneut gestartet werden soll, muss zuvor das Output-Verzeichnis gelöscht werden (sowohl wenn man Output ins lokale Dateisystem als auch wenn man dies in hdfs schreibt)!</w:t>
+      </w:r>
+    </w:p>
+    <w:p>
+      <w:pPr>
+        <w:pStyle w:val="berschrift2"/>
+        <w:numPr>
+          <w:ilvl w:val="0"/>
+          <w:numId w:val="3"/>
+        </w:numPr>
+        <w:rPr>
+          <w:lang w:val="de-DE"/>
+        </w:rPr>
+      </w:pPr>
+      <w:r>
+        <w:rPr>
+          <w:lang w:val="de-DE"/>
+        </w:rPr>
+        <w:t>Optional: Nur wenn yarn konfiguriert und verwendet wurde</w:t>
+      </w:r>
     </w:p>
     <w:p>
       <w:pPr>
@@ -4853,61 +3361,7 @@
           <w:sz w:val="22"/>
           <w:lang w:val="de-DE"/>
         </w:rPr>
-        <w:t xml:space="preserve">Auf der Webseite von </w:t>
-      </w:r>
-      <w:proofErr w:type="spellStart"/>
-      <w:r>
-        <w:rPr>
-          <w:rFonts w:asciiTheme="minorHAnsi" w:hAnsiTheme="minorHAnsi" w:cstheme="minorBidi"/>
-          <w:sz w:val="22"/>
-          <w:lang w:val="de-DE"/>
-        </w:rPr>
-        <w:t>Yarn</w:t>
-      </w:r>
-      <w:proofErr w:type="spellEnd"/>
-      <w:r>
-        <w:rPr>
-          <w:rFonts w:asciiTheme="minorHAnsi" w:hAnsiTheme="minorHAnsi" w:cstheme="minorBidi"/>
-          <w:sz w:val="22"/>
-          <w:lang w:val="de-DE"/>
-        </w:rPr>
-        <w:t xml:space="preserve"> sieht man die erledigten Jobs ebenfalls (zu sehen nur im Fall, wenn mapreduce.framework.name auf „</w:t>
-      </w:r>
-      <w:proofErr w:type="spellStart"/>
-      <w:r>
-        <w:rPr>
-          <w:rFonts w:asciiTheme="minorHAnsi" w:hAnsiTheme="minorHAnsi" w:cstheme="minorBidi"/>
-          <w:sz w:val="22"/>
-          <w:lang w:val="de-DE"/>
-        </w:rPr>
-        <w:t>yarn</w:t>
-      </w:r>
-      <w:proofErr w:type="spellEnd"/>
-      <w:r>
-        <w:rPr>
-          <w:rFonts w:asciiTheme="minorHAnsi" w:hAnsiTheme="minorHAnsi" w:cstheme="minorBidi"/>
-          <w:sz w:val="22"/>
-          <w:lang w:val="de-DE"/>
-        </w:rPr>
-        <w:t>“ und nicht „</w:t>
-      </w:r>
-      <w:proofErr w:type="spellStart"/>
-      <w:r>
-        <w:rPr>
-          <w:rFonts w:asciiTheme="minorHAnsi" w:hAnsiTheme="minorHAnsi" w:cstheme="minorBidi"/>
-          <w:sz w:val="22"/>
-          <w:lang w:val="de-DE"/>
-        </w:rPr>
-        <w:t>local</w:t>
-      </w:r>
-      <w:proofErr w:type="spellEnd"/>
-      <w:r>
-        <w:rPr>
-          <w:rFonts w:asciiTheme="minorHAnsi" w:hAnsiTheme="minorHAnsi" w:cstheme="minorBidi"/>
-          <w:sz w:val="22"/>
-          <w:lang w:val="de-DE"/>
-        </w:rPr>
-        <w:t>“ eingestellt wurde):</w:t>
+        <w:t>Auf der Webseite von Yarn sieht man die erledigten Jobs ebenfalls (zu sehen nur im Fall, wenn mapreduce.framework.name auf „yarn“ und nicht „local“ eingestellt wurde):</w:t>
       </w:r>
     </w:p>
     <w:p>
@@ -4961,33 +3415,6 @@
         <w:pStyle w:val="Source"/>
       </w:pPr>
     </w:p>
-    <w:p>
-      <w:pPr>
-        <w:rPr>
-          <w:color w:val="FF0000"/>
-        </w:rPr>
-      </w:pPr>
-      <w:r>
-        <w:rPr>
-          <w:color w:val="FF0000"/>
-        </w:rPr>
-        <w:t xml:space="preserve">Wichtig: wenn der Job erneut gestartet werden soll, muss zuvor das Output-Verzeichnis gelöscht werden (sowohl wenn man Output ins lokale Dateisystem als auch wenn man dies in </w:t>
-      </w:r>
-      <w:proofErr w:type="spellStart"/>
-      <w:r>
-        <w:rPr>
-          <w:color w:val="FF0000"/>
-        </w:rPr>
-        <w:t>hdfs</w:t>
-      </w:r>
-      <w:proofErr w:type="spellEnd"/>
-      <w:r>
-        <w:rPr>
-          <w:color w:val="FF0000"/>
-        </w:rPr>
-        <w:t xml:space="preserve"> schreibt)!</w:t>
-      </w:r>
-    </w:p>
     <w:p/>
     <w:sectPr>
       <w:pgSz w:w="11906" w:h="16838"/>
@@ -5204,6 +3631,95 @@
     </w:lvl>
   </w:abstractNum>
   <w:abstractNum w:abstractNumId="2" w15:restartNumberingAfterBreak="0">
+    <w:nsid w:val="292C35B7"/>
+    <w:multiLevelType w:val="hybridMultilevel"/>
+    <w:tmpl w:val="CD026C54"/>
+    <w:lvl w:ilvl="0" w:tplc="0407000F">
+      <w:start w:val="12"/>
+      <w:numFmt w:val="decimal"/>
+      <w:lvlText w:val="%1."/>
+      <w:lvlJc w:val="left"/>
+      <w:pPr>
+        <w:ind w:left="720" w:hanging="360"/>
+      </w:pPr>
+      <w:rPr>
+        <w:rFonts w:hint="default"/>
+      </w:rPr>
+    </w:lvl>
+    <w:lvl w:ilvl="1" w:tplc="04070019" w:tentative="1">
+      <w:start w:val="1"/>
+      <w:numFmt w:val="lowerLetter"/>
+      <w:lvlText w:val="%2."/>
+      <w:lvlJc w:val="left"/>
+      <w:pPr>
+        <w:ind w:left="1440" w:hanging="360"/>
+      </w:pPr>
+    </w:lvl>
+    <w:lvl w:ilvl="2" w:tplc="0407001B" w:tentative="1">
+      <w:start w:val="1"/>
+      <w:numFmt w:val="lowerRoman"/>
+      <w:lvlText w:val="%3."/>
+      <w:lvlJc w:val="right"/>
+      <w:pPr>
+        <w:ind w:left="2160" w:hanging="180"/>
+      </w:pPr>
+    </w:lvl>
+    <w:lvl w:ilvl="3" w:tplc="0407000F" w:tentative="1">
+      <w:start w:val="1"/>
+      <w:numFmt w:val="decimal"/>
+      <w:lvlText w:val="%4."/>
+      <w:lvlJc w:val="left"/>
+      <w:pPr>
+        <w:ind w:left="2880" w:hanging="360"/>
+      </w:pPr>
+    </w:lvl>
+    <w:lvl w:ilvl="4" w:tplc="04070019" w:tentative="1">
+      <w:start w:val="1"/>
+      <w:numFmt w:val="lowerLetter"/>
+      <w:lvlText w:val="%5."/>
+      <w:lvlJc w:val="left"/>
+      <w:pPr>
+        <w:ind w:left="3600" w:hanging="360"/>
+      </w:pPr>
+    </w:lvl>
+    <w:lvl w:ilvl="5" w:tplc="0407001B" w:tentative="1">
+      <w:start w:val="1"/>
+      <w:numFmt w:val="lowerRoman"/>
+      <w:lvlText w:val="%6."/>
+      <w:lvlJc w:val="right"/>
+      <w:pPr>
+        <w:ind w:left="4320" w:hanging="180"/>
+      </w:pPr>
+    </w:lvl>
+    <w:lvl w:ilvl="6" w:tplc="0407000F" w:tentative="1">
+      <w:start w:val="1"/>
+      <w:numFmt w:val="decimal"/>
+      <w:lvlText w:val="%7."/>
+      <w:lvlJc w:val="left"/>
+      <w:pPr>
+        <w:ind w:left="5040" w:hanging="360"/>
+      </w:pPr>
+    </w:lvl>
+    <w:lvl w:ilvl="7" w:tplc="04070019" w:tentative="1">
+      <w:start w:val="1"/>
+      <w:numFmt w:val="lowerLetter"/>
+      <w:lvlText w:val="%8."/>
+      <w:lvlJc w:val="left"/>
+      <w:pPr>
+        <w:ind w:left="5760" w:hanging="360"/>
+      </w:pPr>
+    </w:lvl>
+    <w:lvl w:ilvl="8" w:tplc="0407001B" w:tentative="1">
+      <w:start w:val="1"/>
+      <w:numFmt w:val="lowerRoman"/>
+      <w:lvlText w:val="%9."/>
+      <w:lvlJc w:val="right"/>
+      <w:pPr>
+        <w:ind w:left="6480" w:hanging="180"/>
+      </w:pPr>
+    </w:lvl>
+  </w:abstractNum>
+  <w:abstractNum w:abstractNumId="3" w15:restartNumberingAfterBreak="0">
     <w:nsid w:val="4B4C6431"/>
     <w:multiLevelType w:val="hybridMultilevel"/>
     <w:tmpl w:val="E6C6EDF0"/>
@@ -5316,7 +3832,7 @@
       </w:rPr>
     </w:lvl>
   </w:abstractNum>
-  <w:abstractNum w:abstractNumId="3" w15:restartNumberingAfterBreak="0">
+  <w:abstractNum w:abstractNumId="4" w15:restartNumberingAfterBreak="0">
     <w:nsid w:val="5387382B"/>
     <w:multiLevelType w:val="hybridMultilevel"/>
     <w:tmpl w:val="3AD6778C"/>
@@ -5405,7 +3921,7 @@
       </w:pPr>
     </w:lvl>
   </w:abstractNum>
-  <w:abstractNum w:abstractNumId="4" w15:restartNumberingAfterBreak="0">
+  <w:abstractNum w:abstractNumId="5" w15:restartNumberingAfterBreak="0">
     <w:nsid w:val="538C6D86"/>
     <w:multiLevelType w:val="hybridMultilevel"/>
     <w:tmpl w:val="5EDA593A"/>
@@ -5492,7 +4008,7 @@
       </w:pPr>
     </w:lvl>
   </w:abstractNum>
-  <w:abstractNum w:abstractNumId="5" w15:restartNumberingAfterBreak="0">
+  <w:abstractNum w:abstractNumId="6" w15:restartNumberingAfterBreak="0">
     <w:nsid w:val="60377AE6"/>
     <w:multiLevelType w:val="hybridMultilevel"/>
     <w:tmpl w:val="414EA918"/>
@@ -5605,7 +4121,7 @@
       </w:rPr>
     </w:lvl>
   </w:abstractNum>
-  <w:abstractNum w:abstractNumId="6" w15:restartNumberingAfterBreak="0">
+  <w:abstractNum w:abstractNumId="7" w15:restartNumberingAfterBreak="0">
     <w:nsid w:val="6CCB6B16"/>
     <w:multiLevelType w:val="hybridMultilevel"/>
     <w:tmpl w:val="280844D0"/>
@@ -5695,34 +4211,34 @@
     </w:lvl>
   </w:abstractNum>
   <w:num w:numId="1" w16cid:durableId="1997680659">
-    <w:abstractNumId w:val="3"/>
+    <w:abstractNumId w:val="4"/>
   </w:num>
   <w:num w:numId="2" w16cid:durableId="1581712612">
-    <w:abstractNumId w:val="4"/>
+    <w:abstractNumId w:val="5"/>
   </w:num>
   <w:num w:numId="3" w16cid:durableId="1941329508">
-    <w:abstractNumId w:val="6"/>
+    <w:abstractNumId w:val="7"/>
   </w:num>
   <w:num w:numId="4" w16cid:durableId="1094547871">
-    <w:abstractNumId w:val="4"/>
+    <w:abstractNumId w:val="5"/>
     <w:lvlOverride w:ilvl="0">
       <w:startOverride w:val="1"/>
     </w:lvlOverride>
   </w:num>
   <w:num w:numId="5" w16cid:durableId="1446121024">
-    <w:abstractNumId w:val="4"/>
+    <w:abstractNumId w:val="5"/>
   </w:num>
   <w:num w:numId="6" w16cid:durableId="319963722">
-    <w:abstractNumId w:val="4"/>
+    <w:abstractNumId w:val="5"/>
     <w:lvlOverride w:ilvl="0">
       <w:startOverride w:val="1"/>
     </w:lvlOverride>
   </w:num>
   <w:num w:numId="7" w16cid:durableId="1425958988">
-    <w:abstractNumId w:val="4"/>
+    <w:abstractNumId w:val="5"/>
   </w:num>
   <w:num w:numId="8" w16cid:durableId="767039704">
-    <w:abstractNumId w:val="2"/>
+    <w:abstractNumId w:val="3"/>
   </w:num>
   <w:num w:numId="9" w16cid:durableId="411200799">
     <w:abstractNumId w:val="0"/>
@@ -5731,7 +4247,16 @@
     <w:abstractNumId w:val="1"/>
   </w:num>
   <w:num w:numId="11" w16cid:durableId="1862819938">
+    <w:abstractNumId w:val="6"/>
+  </w:num>
+  <w:num w:numId="12" w16cid:durableId="993069745">
     <w:abstractNumId w:val="5"/>
+    <w:lvlOverride w:ilvl="0">
+      <w:startOverride w:val="1"/>
+    </w:lvlOverride>
+  </w:num>
+  <w:num w:numId="13" w16cid:durableId="1359239606">
+    <w:abstractNumId w:val="2"/>
   </w:num>
 </w:numbering>
 </file>
@@ -6229,6 +4754,7 @@
   <w:style w:type="character" w:default="1" w:styleId="Absatz-Standardschriftart">
     <w:name w:val="Default Paragraph Font"/>
     <w:uiPriority w:val="1"/>
+    <w:semiHidden/>
     <w:unhideWhenUsed/>
   </w:style>
   <w:style w:type="table" w:default="1" w:styleId="NormaleTabelle">

</xml_diff>